<commit_message>
Add New Resume fixing page problems
</commit_message>
<xml_diff>
--- a/Software-Developer-Tarun-Kumar-FlowCV-Resume-20250315 (1).docx
+++ b/Software-Developer-Tarun-Kumar-FlowCV-Resume-20250315 (1).docx
@@ -6,19 +6,19 @@
       <w:pPr>
         <w:pStyle w:val="BodyText"/>
         <w:rPr>
-          <w:rFonts w:ascii="Century Gothic" w:hAnsi="Century Gothic"/>
-          <w:sz w:val="20"/>
-        </w:rPr>
-      </w:pPr>
-      <w:r>
-        <w:rPr>
-          <w:rFonts w:ascii="Century Gothic" w:hAnsi="Century Gothic"/>
+          <w:rFonts w:ascii="Calibri" w:hAnsi="Calibri" w:cs="Calibri"/>
+          <w:sz w:val="20"/>
+        </w:rPr>
+      </w:pPr>
+      <w:r>
+        <w:rPr>
+          <w:rFonts w:ascii="Calibri" w:hAnsi="Calibri" w:cs="Calibri"/>
           <w:noProof/>
         </w:rPr>
         <mc:AlternateContent>
           <mc:Choice Requires="wps">
             <w:drawing>
-              <wp:anchor distT="0" distB="0" distL="0" distR="0" simplePos="0" relativeHeight="251704832" behindDoc="1" locked="0" layoutInCell="1" allowOverlap="1" wp14:anchorId="3F17741B" wp14:editId="6ACF7A44">
+              <wp:anchor distT="0" distB="0" distL="0" distR="0" simplePos="0" relativeHeight="251658752" behindDoc="1" locked="0" layoutInCell="1" allowOverlap="1" wp14:anchorId="3F17741B" wp14:editId="26381911">
                 <wp:simplePos x="0" y="0"/>
                 <wp:positionH relativeFrom="page">
                   <wp:posOffset>-133350</wp:posOffset>
@@ -94,7 +94,7 @@
           </mc:Choice>
           <mc:Fallback>
             <w:pict>
-              <v:shape w14:anchorId="41B9804F" id="Graphic 1" o:spid="_x0000_s1026" style="position:absolute;margin-left:-10.5pt;margin-top:-2pt;width:249pt;height:841.95pt;z-index:-251611648;visibility:visible;mso-wrap-style:square;mso-width-percent:0;mso-wrap-distance-left:0;mso-wrap-distance-top:0;mso-wrap-distance-right:0;mso-wrap-distance-bottom:0;mso-position-horizontal:absolute;mso-position-horizontal-relative:page;mso-position-vertical:absolute;mso-position-vertical-relative:page;mso-width-percent:0;mso-width-relative:margin;v-text-anchor:top" coordsize="3019425,10692765" o:gfxdata="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" path="m,10692383l,,3019424,r,10692383l,10692383xe" fillcolor="#7f7f7f [1612]" stroked="f">
+              <v:shape w14:anchorId="126ACB4B" id="Graphic 1" o:spid="_x0000_s1026" style="position:absolute;margin-left:-10.5pt;margin-top:-2pt;width:249pt;height:841.95pt;z-index:-251657728;visibility:visible;mso-wrap-style:square;mso-width-percent:0;mso-wrap-distance-left:0;mso-wrap-distance-top:0;mso-wrap-distance-right:0;mso-wrap-distance-bottom:0;mso-position-horizontal:absolute;mso-position-horizontal-relative:page;mso-position-vertical:absolute;mso-position-vertical-relative:page;mso-width-percent:0;mso-width-relative:margin;v-text-anchor:top" coordsize="3019425,10692765" o:gfxdata="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" path="m,10692383l,,3019424,r,10692383l,10692383xe" fillcolor="#7f7f7f [1612]" stroked="f">
                 <v:path arrowok="t"/>
                 <w10:wrap anchorx="page" anchory="page"/>
               </v:shape>
@@ -107,7 +107,7 @@
       <w:pPr>
         <w:pStyle w:val="BodyText"/>
         <w:rPr>
-          <w:rFonts w:ascii="Century Gothic" w:hAnsi="Century Gothic"/>
+          <w:rFonts w:ascii="Calibri" w:hAnsi="Calibri" w:cs="Calibri"/>
           <w:sz w:val="20"/>
         </w:rPr>
       </w:pPr>
@@ -116,7 +116,7 @@
       <w:pPr>
         <w:pStyle w:val="BodyText"/>
         <w:rPr>
-          <w:rFonts w:ascii="Century Gothic" w:hAnsi="Century Gothic"/>
+          <w:rFonts w:ascii="Calibri" w:hAnsi="Calibri" w:cs="Calibri"/>
           <w:sz w:val="20"/>
         </w:rPr>
       </w:pPr>
@@ -125,7 +125,7 @@
       <w:pPr>
         <w:pStyle w:val="BodyText"/>
         <w:rPr>
-          <w:rFonts w:ascii="Century Gothic" w:hAnsi="Century Gothic"/>
+          <w:rFonts w:ascii="Calibri" w:hAnsi="Calibri" w:cs="Calibri"/>
           <w:sz w:val="20"/>
         </w:rPr>
         <w:sectPr>
@@ -141,7 +141,7 @@
         <w:pStyle w:val="BodyText"/>
         <w:spacing w:before="253"/>
         <w:rPr>
-          <w:rFonts w:ascii="Century Gothic" w:hAnsi="Century Gothic"/>
+          <w:rFonts w:ascii="Calibri" w:hAnsi="Calibri" w:cs="Calibri"/>
           <w:b/>
           <w:sz w:val="45"/>
         </w:rPr>
@@ -151,14 +151,15 @@
       <w:pPr>
         <w:pStyle w:val="Heading1"/>
         <w:rPr>
-          <w:rFonts w:ascii="Century Gothic" w:hAnsi="Century Gothic"/>
+          <w:rFonts w:ascii="Calibri" w:hAnsi="Calibri" w:cs="Calibri"/>
           <w:sz w:val="22"/>
           <w:szCs w:val="22"/>
         </w:rPr>
       </w:pPr>
-      <w:r>
-        <w:rPr>
-          <w:rFonts w:ascii="Century Gothic" w:hAnsi="Century Gothic"/>
+      <w:bookmarkStart w:id="0" w:name="_Hlk192949331"/>
+      <w:r>
+        <w:rPr>
+          <w:rFonts w:ascii="Calibri" w:hAnsi="Calibri" w:cs="Calibri"/>
           <w:color w:val="F6F7F1"/>
           <w:spacing w:val="-2"/>
           <w:sz w:val="22"/>
@@ -172,7 +173,7 @@
         <w:pStyle w:val="BodyText"/>
         <w:spacing w:before="3"/>
         <w:rPr>
-          <w:rFonts w:ascii="Century Gothic" w:hAnsi="Century Gothic"/>
+          <w:rFonts w:ascii="Calibri" w:hAnsi="Calibri" w:cs="Calibri"/>
           <w:b/>
           <w:sz w:val="3"/>
         </w:rPr>
@@ -184,13 +185,13 @@
         <w:spacing w:line="30" w:lineRule="exact"/>
         <w:ind w:left="28" w:right="-72"/>
         <w:rPr>
-          <w:rFonts w:ascii="Century Gothic" w:hAnsi="Century Gothic"/>
+          <w:rFonts w:ascii="Calibri" w:hAnsi="Calibri" w:cs="Calibri"/>
           <w:sz w:val="2"/>
         </w:rPr>
       </w:pPr>
       <w:r>
         <w:rPr>
-          <w:rFonts w:ascii="Century Gothic" w:hAnsi="Century Gothic"/>
+          <w:rFonts w:ascii="Calibri" w:hAnsi="Calibri" w:cs="Calibri"/>
           <w:noProof/>
           <w:sz w:val="2"/>
         </w:rPr>
@@ -272,7 +273,7 @@
           </mc:Choice>
           <mc:Fallback>
             <w:pict>
-              <v:group w14:anchorId="3369451D" id="Group 2" o:spid="_x0000_s1026" style="width:146.25pt;height:1.5pt;mso-position-horizontal-relative:char;mso-position-vertical-relative:line" coordsize="18573,190" o:gfxdata="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">
+              <v:group w14:anchorId="336258D7" id="Group 2" o:spid="_x0000_s1026" style="width:146.25pt;height:1.5pt;mso-position-horizontal-relative:char;mso-position-vertical-relative:line" coordsize="18573,190" o:gfxdata="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">
                 <v:shape id="Graphic 3" o:spid="_x0000_s1027" style="position:absolute;width:18573;height:190;visibility:visible;mso-wrap-style:square;v-text-anchor:top" coordsize="1857375,19050" o:gfxdata="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" path="m1857374,19049l,19049,,,1857374,r,19049xe" fillcolor="#f6f7f1" stroked="f">
                   <v:path arrowok="t"/>
                 </v:shape>
@@ -289,14 +290,14 @@
         <w:spacing w:before="170" w:line="256" w:lineRule="auto"/>
         <w:ind w:left="28"/>
         <w:rPr>
-          <w:rFonts w:ascii="Century Gothic" w:hAnsi="Century Gothic"/>
-          <w:sz w:val="20"/>
-          <w:szCs w:val="20"/>
-        </w:rPr>
-      </w:pPr>
-      <w:r>
-        <w:rPr>
-          <w:rFonts w:ascii="Century Gothic" w:hAnsi="Century Gothic"/>
+          <w:rFonts w:ascii="Calibri" w:hAnsi="Calibri" w:cs="Calibri"/>
+          <w:sz w:val="20"/>
+          <w:szCs w:val="20"/>
+        </w:rPr>
+      </w:pPr>
+      <w:r>
+        <w:rPr>
+          <w:rFonts w:ascii="Calibri" w:hAnsi="Calibri" w:cs="Calibri"/>
           <w:color w:val="F6F7F1"/>
           <w:spacing w:val="-6"/>
           <w:sz w:val="20"/>
@@ -306,7 +307,7 @@
       </w:r>
       <w:r>
         <w:rPr>
-          <w:rFonts w:ascii="Century Gothic" w:hAnsi="Century Gothic"/>
+          <w:rFonts w:ascii="Calibri" w:hAnsi="Calibri" w:cs="Calibri"/>
           <w:color w:val="F6F7F1"/>
           <w:spacing w:val="-11"/>
           <w:sz w:val="20"/>
@@ -316,7 +317,7 @@
       </w:r>
       <w:r>
         <w:rPr>
-          <w:rFonts w:ascii="Century Gothic" w:hAnsi="Century Gothic"/>
+          <w:rFonts w:ascii="Calibri" w:hAnsi="Calibri" w:cs="Calibri"/>
           <w:color w:val="F6F7F1"/>
           <w:spacing w:val="-6"/>
           <w:sz w:val="20"/>
@@ -326,7 +327,7 @@
       </w:r>
       <w:r>
         <w:rPr>
-          <w:rFonts w:ascii="Century Gothic" w:hAnsi="Century Gothic"/>
+          <w:rFonts w:ascii="Calibri" w:hAnsi="Calibri" w:cs="Calibri"/>
           <w:color w:val="F6F7F1"/>
           <w:spacing w:val="-11"/>
           <w:sz w:val="20"/>
@@ -336,7 +337,7 @@
       </w:r>
       <w:r>
         <w:rPr>
-          <w:rFonts w:ascii="Century Gothic" w:hAnsi="Century Gothic"/>
+          <w:rFonts w:ascii="Calibri" w:hAnsi="Calibri" w:cs="Calibri"/>
           <w:color w:val="F6F7F1"/>
           <w:spacing w:val="-6"/>
           <w:sz w:val="20"/>
@@ -346,7 +347,7 @@
       </w:r>
       <w:r>
         <w:rPr>
-          <w:rFonts w:ascii="Century Gothic" w:hAnsi="Century Gothic"/>
+          <w:rFonts w:ascii="Calibri" w:hAnsi="Calibri" w:cs="Calibri"/>
           <w:color w:val="F6F7F1"/>
           <w:spacing w:val="-11"/>
           <w:sz w:val="20"/>
@@ -356,7 +357,7 @@
       </w:r>
       <w:r>
         <w:rPr>
-          <w:rFonts w:ascii="Century Gothic" w:hAnsi="Century Gothic"/>
+          <w:rFonts w:ascii="Calibri" w:hAnsi="Calibri" w:cs="Calibri"/>
           <w:color w:val="F6F7F1"/>
           <w:spacing w:val="-6"/>
           <w:sz w:val="20"/>
@@ -366,7 +367,7 @@
       </w:r>
       <w:r>
         <w:rPr>
-          <w:rFonts w:ascii="Century Gothic" w:hAnsi="Century Gothic"/>
+          <w:rFonts w:ascii="Calibri" w:hAnsi="Calibri" w:cs="Calibri"/>
           <w:color w:val="F6F7F1"/>
           <w:spacing w:val="-11"/>
           <w:sz w:val="20"/>
@@ -376,7 +377,7 @@
       </w:r>
       <w:r>
         <w:rPr>
-          <w:rFonts w:ascii="Century Gothic" w:hAnsi="Century Gothic"/>
+          <w:rFonts w:ascii="Calibri" w:hAnsi="Calibri" w:cs="Calibri"/>
           <w:color w:val="F6F7F1"/>
           <w:spacing w:val="-6"/>
           <w:sz w:val="20"/>
@@ -386,7 +387,7 @@
       </w:r>
       <w:r>
         <w:rPr>
-          <w:rFonts w:ascii="Century Gothic" w:hAnsi="Century Gothic"/>
+          <w:rFonts w:ascii="Calibri" w:hAnsi="Calibri" w:cs="Calibri"/>
           <w:color w:val="F6F7F1"/>
           <w:spacing w:val="-11"/>
           <w:sz w:val="20"/>
@@ -396,7 +397,7 @@
       </w:r>
       <w:r>
         <w:rPr>
-          <w:rFonts w:ascii="Century Gothic" w:hAnsi="Century Gothic"/>
+          <w:rFonts w:ascii="Calibri" w:hAnsi="Calibri" w:cs="Calibri"/>
           <w:color w:val="F6F7F1"/>
           <w:spacing w:val="-6"/>
           <w:sz w:val="20"/>
@@ -406,7 +407,7 @@
       </w:r>
       <w:r>
         <w:rPr>
-          <w:rFonts w:ascii="Century Gothic" w:hAnsi="Century Gothic"/>
+          <w:rFonts w:ascii="Calibri" w:hAnsi="Calibri" w:cs="Calibri"/>
           <w:color w:val="F6F7F1"/>
           <w:sz w:val="20"/>
           <w:szCs w:val="20"/>
@@ -415,7 +416,7 @@
       </w:r>
       <w:r>
         <w:rPr>
-          <w:rFonts w:ascii="Century Gothic" w:hAnsi="Century Gothic"/>
+          <w:rFonts w:ascii="Calibri" w:hAnsi="Calibri" w:cs="Calibri"/>
           <w:color w:val="F6F7F1"/>
           <w:spacing w:val="-2"/>
           <w:sz w:val="20"/>
@@ -425,7 +426,7 @@
       </w:r>
       <w:r>
         <w:rPr>
-          <w:rFonts w:ascii="Century Gothic" w:hAnsi="Century Gothic"/>
+          <w:rFonts w:ascii="Calibri" w:hAnsi="Calibri" w:cs="Calibri"/>
           <w:color w:val="F6F7F1"/>
           <w:sz w:val="20"/>
           <w:szCs w:val="20"/>
@@ -434,7 +435,7 @@
       </w:r>
       <w:r>
         <w:rPr>
-          <w:rFonts w:ascii="Century Gothic" w:hAnsi="Century Gothic"/>
+          <w:rFonts w:ascii="Calibri" w:hAnsi="Calibri" w:cs="Calibri"/>
           <w:color w:val="F6F7F1"/>
           <w:spacing w:val="-2"/>
           <w:sz w:val="20"/>
@@ -444,7 +445,7 @@
       </w:r>
       <w:r>
         <w:rPr>
-          <w:rFonts w:ascii="Century Gothic" w:hAnsi="Century Gothic"/>
+          <w:rFonts w:ascii="Calibri" w:hAnsi="Calibri" w:cs="Calibri"/>
           <w:color w:val="F6F7F1"/>
           <w:sz w:val="20"/>
           <w:szCs w:val="20"/>
@@ -453,7 +454,7 @@
       </w:r>
       <w:r>
         <w:rPr>
-          <w:rFonts w:ascii="Century Gothic" w:hAnsi="Century Gothic"/>
+          <w:rFonts w:ascii="Calibri" w:hAnsi="Calibri" w:cs="Calibri"/>
           <w:color w:val="F6F7F1"/>
           <w:spacing w:val="-2"/>
           <w:sz w:val="20"/>
@@ -463,7 +464,7 @@
       </w:r>
       <w:r>
         <w:rPr>
-          <w:rFonts w:ascii="Century Gothic" w:hAnsi="Century Gothic"/>
+          <w:rFonts w:ascii="Calibri" w:hAnsi="Calibri" w:cs="Calibri"/>
           <w:color w:val="F6F7F1"/>
           <w:sz w:val="20"/>
           <w:szCs w:val="20"/>
@@ -472,7 +473,7 @@
       </w:r>
       <w:r>
         <w:rPr>
-          <w:rFonts w:ascii="Century Gothic" w:hAnsi="Century Gothic"/>
+          <w:rFonts w:ascii="Calibri" w:hAnsi="Calibri" w:cs="Calibri"/>
           <w:color w:val="F6F7F1"/>
           <w:sz w:val="20"/>
           <w:szCs w:val="20"/>
@@ -486,14 +487,14 @@
         <w:spacing w:line="256" w:lineRule="auto"/>
         <w:ind w:left="28" w:right="340"/>
         <w:rPr>
-          <w:rFonts w:ascii="Century Gothic" w:hAnsi="Century Gothic"/>
-          <w:sz w:val="20"/>
-          <w:szCs w:val="20"/>
-        </w:rPr>
-      </w:pPr>
-      <w:r>
-        <w:rPr>
-          <w:rFonts w:ascii="Century Gothic" w:hAnsi="Century Gothic"/>
+          <w:rFonts w:ascii="Calibri" w:hAnsi="Calibri" w:cs="Calibri"/>
+          <w:sz w:val="20"/>
+          <w:szCs w:val="20"/>
+        </w:rPr>
+      </w:pPr>
+      <w:r>
+        <w:rPr>
+          <w:rFonts w:ascii="Calibri" w:hAnsi="Calibri" w:cs="Calibri"/>
           <w:color w:val="F6F7F1"/>
           <w:spacing w:val="-2"/>
           <w:sz w:val="20"/>
@@ -503,7 +504,7 @@
       </w:r>
       <w:r>
         <w:rPr>
-          <w:rFonts w:ascii="Century Gothic" w:hAnsi="Century Gothic"/>
+          <w:rFonts w:ascii="Calibri" w:hAnsi="Calibri" w:cs="Calibri"/>
           <w:color w:val="F6F7F1"/>
           <w:spacing w:val="-12"/>
           <w:sz w:val="20"/>
@@ -513,7 +514,7 @@
       </w:r>
       <w:r>
         <w:rPr>
-          <w:rFonts w:ascii="Century Gothic" w:hAnsi="Century Gothic"/>
+          <w:rFonts w:ascii="Calibri" w:hAnsi="Calibri" w:cs="Calibri"/>
           <w:color w:val="F6F7F1"/>
           <w:spacing w:val="-2"/>
           <w:sz w:val="20"/>
@@ -523,7 +524,7 @@
       </w:r>
       <w:r>
         <w:rPr>
-          <w:rFonts w:ascii="Century Gothic" w:hAnsi="Century Gothic"/>
+          <w:rFonts w:ascii="Calibri" w:hAnsi="Calibri" w:cs="Calibri"/>
           <w:color w:val="F6F7F1"/>
           <w:spacing w:val="-12"/>
           <w:sz w:val="20"/>
@@ -533,17 +534,27 @@
       </w:r>
       <w:r>
         <w:rPr>
-          <w:rFonts w:ascii="Century Gothic" w:hAnsi="Century Gothic"/>
+          <w:rFonts w:ascii="Calibri" w:hAnsi="Calibri" w:cs="Calibri"/>
           <w:color w:val="F6F7F1"/>
           <w:spacing w:val="-2"/>
           <w:sz w:val="20"/>
           <w:szCs w:val="20"/>
         </w:rPr>
-        <w:t>client</w:t>
-      </w:r>
-      <w:r>
-        <w:rPr>
-          <w:rFonts w:ascii="Century Gothic" w:hAnsi="Century Gothic"/>
+        <w:t>C</w:t>
+      </w:r>
+      <w:r>
+        <w:rPr>
+          <w:rFonts w:ascii="Calibri" w:hAnsi="Calibri" w:cs="Calibri"/>
+          <w:color w:val="F6F7F1"/>
+          <w:spacing w:val="-2"/>
+          <w:sz w:val="20"/>
+          <w:szCs w:val="20"/>
+        </w:rPr>
+        <w:t>lient</w:t>
+      </w:r>
+      <w:r>
+        <w:rPr>
+          <w:rFonts w:ascii="Calibri" w:hAnsi="Calibri" w:cs="Calibri"/>
           <w:color w:val="F6F7F1"/>
           <w:spacing w:val="-12"/>
           <w:sz w:val="20"/>
@@ -553,17 +564,27 @@
       </w:r>
       <w:r>
         <w:rPr>
-          <w:rFonts w:ascii="Century Gothic" w:hAnsi="Century Gothic"/>
+          <w:rFonts w:ascii="Calibri" w:hAnsi="Calibri" w:cs="Calibri"/>
           <w:color w:val="F6F7F1"/>
           <w:spacing w:val="-2"/>
           <w:sz w:val="20"/>
           <w:szCs w:val="20"/>
         </w:rPr>
-        <w:t xml:space="preserve">language </w:t>
-      </w:r>
-      <w:r>
-        <w:rPr>
-          <w:rFonts w:ascii="Century Gothic" w:hAnsi="Century Gothic"/>
+        <w:t>L</w:t>
+      </w:r>
+      <w:r>
+        <w:rPr>
+          <w:rFonts w:ascii="Calibri" w:hAnsi="Calibri" w:cs="Calibri"/>
+          <w:color w:val="F6F7F1"/>
+          <w:spacing w:val="-2"/>
+          <w:sz w:val="20"/>
+          <w:szCs w:val="20"/>
+        </w:rPr>
+        <w:t xml:space="preserve">anguage </w:t>
+      </w:r>
+      <w:r>
+        <w:rPr>
+          <w:rFonts w:ascii="Calibri" w:hAnsi="Calibri" w:cs="Calibri"/>
           <w:color w:val="F6F7F1"/>
           <w:sz w:val="20"/>
           <w:szCs w:val="20"/>
@@ -576,7 +597,7 @@
         <w:pStyle w:val="BodyText"/>
         <w:spacing w:before="188"/>
         <w:rPr>
-          <w:rFonts w:ascii="Century Gothic" w:hAnsi="Century Gothic"/>
+          <w:rFonts w:ascii="Calibri" w:hAnsi="Calibri" w:cs="Calibri"/>
         </w:rPr>
       </w:pPr>
     </w:p>
@@ -584,14 +605,14 @@
       <w:pPr>
         <w:pStyle w:val="Heading1"/>
         <w:rPr>
-          <w:rFonts w:ascii="Century Gothic" w:hAnsi="Century Gothic"/>
+          <w:rFonts w:ascii="Calibri" w:hAnsi="Calibri" w:cs="Calibri"/>
           <w:sz w:val="22"/>
           <w:szCs w:val="22"/>
         </w:rPr>
       </w:pPr>
       <w:r>
         <w:rPr>
-          <w:rFonts w:ascii="Century Gothic" w:hAnsi="Century Gothic"/>
+          <w:rFonts w:ascii="Calibri" w:hAnsi="Calibri" w:cs="Calibri"/>
           <w:color w:val="F6F7F1"/>
           <w:spacing w:val="2"/>
           <w:sz w:val="22"/>
@@ -601,7 +622,7 @@
       </w:r>
       <w:r>
         <w:rPr>
-          <w:rFonts w:ascii="Century Gothic" w:hAnsi="Century Gothic"/>
+          <w:rFonts w:ascii="Calibri" w:hAnsi="Calibri" w:cs="Calibri"/>
           <w:color w:val="F6F7F1"/>
           <w:spacing w:val="45"/>
           <w:sz w:val="22"/>
@@ -611,7 +632,7 @@
       </w:r>
       <w:r>
         <w:rPr>
-          <w:rFonts w:ascii="Century Gothic" w:hAnsi="Century Gothic"/>
+          <w:rFonts w:ascii="Calibri" w:hAnsi="Calibri" w:cs="Calibri"/>
           <w:color w:val="F6F7F1"/>
           <w:spacing w:val="-2"/>
           <w:sz w:val="22"/>
@@ -625,7 +646,7 @@
         <w:pStyle w:val="BodyText"/>
         <w:spacing w:before="3"/>
         <w:rPr>
-          <w:rFonts w:ascii="Century Gothic" w:hAnsi="Century Gothic"/>
+          <w:rFonts w:ascii="Calibri" w:hAnsi="Calibri" w:cs="Calibri"/>
           <w:b/>
           <w:sz w:val="3"/>
         </w:rPr>
@@ -637,13 +658,13 @@
         <w:spacing w:line="30" w:lineRule="exact"/>
         <w:ind w:left="28" w:right="-72"/>
         <w:rPr>
-          <w:rFonts w:ascii="Century Gothic" w:hAnsi="Century Gothic"/>
+          <w:rFonts w:ascii="Calibri" w:hAnsi="Calibri" w:cs="Calibri"/>
           <w:sz w:val="2"/>
         </w:rPr>
       </w:pPr>
       <w:r>
         <w:rPr>
-          <w:rFonts w:ascii="Century Gothic" w:hAnsi="Century Gothic"/>
+          <w:rFonts w:ascii="Calibri" w:hAnsi="Calibri" w:cs="Calibri"/>
           <w:noProof/>
           <w:sz w:val="2"/>
         </w:rPr>
@@ -725,7 +746,7 @@
           </mc:Choice>
           <mc:Fallback>
             <w:pict>
-              <v:group w14:anchorId="08F7C11A" id="Group 4" o:spid="_x0000_s1026" style="width:146.25pt;height:1.5pt;mso-position-horizontal-relative:char;mso-position-vertical-relative:line" coordsize="18573,190" o:gfxdata="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">
+              <v:group w14:anchorId="78A902B4" id="Group 4" o:spid="_x0000_s1026" style="width:146.25pt;height:1.5pt;mso-position-horizontal-relative:char;mso-position-vertical-relative:line" coordsize="18573,190" o:gfxdata="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">
                 <v:shape id="Graphic 5" o:spid="_x0000_s1027" style="position:absolute;width:18573;height:190;visibility:visible;mso-wrap-style:square;v-text-anchor:top" coordsize="1857375,19050" o:gfxdata="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" path="m1857374,19049l,19049,,,1857374,r,19049xe" fillcolor="#f6f7f1" stroked="f">
                   <v:path arrowok="t"/>
                 </v:shape>
@@ -741,14 +762,17 @@
         <w:spacing w:before="170" w:line="271" w:lineRule="auto"/>
         <w:ind w:left="28" w:right="554"/>
         <w:rPr>
-          <w:rFonts w:ascii="Century Gothic" w:hAnsi="Century Gothic"/>
-          <w:sz w:val="20"/>
-          <w:szCs w:val="20"/>
-        </w:rPr>
-      </w:pPr>
-      <w:r>
-        <w:rPr>
-          <w:rFonts w:ascii="Century Gothic" w:hAnsi="Century Gothic"/>
+          <w:rFonts w:ascii="Calibri" w:hAnsi="Calibri" w:cs="Calibri"/>
+          <w:i/>
+          <w:color w:val="F6F7F1"/>
+          <w:spacing w:val="-2"/>
+          <w:sz w:val="20"/>
+          <w:szCs w:val="20"/>
+        </w:rPr>
+      </w:pPr>
+      <w:r>
+        <w:rPr>
+          <w:rFonts w:ascii="Calibri" w:hAnsi="Calibri" w:cs="Calibri"/>
           <w:b/>
           <w:color w:val="F6F7F1"/>
           <w:spacing w:val="-6"/>
@@ -759,7 +783,7 @@
       </w:r>
       <w:r>
         <w:rPr>
-          <w:rFonts w:ascii="Century Gothic" w:hAnsi="Century Gothic"/>
+          <w:rFonts w:ascii="Calibri" w:hAnsi="Calibri" w:cs="Calibri"/>
           <w:b/>
           <w:color w:val="F6F7F1"/>
           <w:spacing w:val="-13"/>
@@ -770,7 +794,7 @@
       </w:r>
       <w:r>
         <w:rPr>
-          <w:rFonts w:ascii="Century Gothic" w:hAnsi="Century Gothic"/>
+          <w:rFonts w:ascii="Calibri" w:hAnsi="Calibri" w:cs="Calibri"/>
           <w:b/>
           <w:color w:val="F6F7F1"/>
           <w:spacing w:val="-6"/>
@@ -781,7 +805,7 @@
       </w:r>
       <w:r>
         <w:rPr>
-          <w:rFonts w:ascii="Century Gothic" w:hAnsi="Century Gothic"/>
+          <w:rFonts w:ascii="Calibri" w:hAnsi="Calibri" w:cs="Calibri"/>
           <w:b/>
           <w:color w:val="F6F7F1"/>
           <w:spacing w:val="-13"/>
@@ -792,7 +816,7 @@
       </w:r>
       <w:r>
         <w:rPr>
-          <w:rFonts w:ascii="Century Gothic" w:hAnsi="Century Gothic"/>
+          <w:rFonts w:ascii="Calibri" w:hAnsi="Calibri" w:cs="Calibri"/>
           <w:b/>
           <w:color w:val="F6F7F1"/>
           <w:spacing w:val="-6"/>
@@ -803,7 +827,7 @@
       </w:r>
       <w:r>
         <w:rPr>
-          <w:rFonts w:ascii="Century Gothic" w:hAnsi="Century Gothic"/>
+          <w:rFonts w:ascii="Calibri" w:hAnsi="Calibri" w:cs="Calibri"/>
           <w:i/>
           <w:color w:val="F6F7F1"/>
           <w:spacing w:val="-2"/>
@@ -814,7 +838,7 @@
       </w:r>
       <w:r>
         <w:rPr>
-          <w:rFonts w:ascii="Century Gothic" w:hAnsi="Century Gothic"/>
+          <w:rFonts w:ascii="Calibri" w:hAnsi="Calibri" w:cs="Calibri"/>
           <w:i/>
           <w:color w:val="F6F7F1"/>
           <w:spacing w:val="-2"/>
@@ -825,7 +849,7 @@
       </w:r>
       <w:r>
         <w:rPr>
-          <w:rFonts w:ascii="Century Gothic" w:hAnsi="Century Gothic"/>
+          <w:rFonts w:ascii="Calibri" w:hAnsi="Calibri" w:cs="Calibri"/>
           <w:i/>
           <w:color w:val="F6F7F1"/>
           <w:spacing w:val="-2"/>
@@ -836,7 +860,7 @@
       </w:r>
       <w:r>
         <w:rPr>
-          <w:rFonts w:ascii="Century Gothic" w:hAnsi="Century Gothic"/>
+          <w:rFonts w:ascii="Calibri" w:hAnsi="Calibri" w:cs="Calibri"/>
           <w:i/>
           <w:color w:val="F6F7F1"/>
           <w:spacing w:val="-2"/>
@@ -847,7 +871,7 @@
       </w:r>
       <w:r>
         <w:rPr>
-          <w:rFonts w:ascii="Century Gothic" w:hAnsi="Century Gothic"/>
+          <w:rFonts w:ascii="Calibri" w:hAnsi="Calibri" w:cs="Calibri"/>
           <w:i/>
           <w:color w:val="F6F7F1"/>
           <w:spacing w:val="-2"/>
@@ -858,7 +882,7 @@
       </w:r>
       <w:r>
         <w:rPr>
-          <w:rFonts w:ascii="Century Gothic" w:hAnsi="Century Gothic"/>
+          <w:rFonts w:ascii="Calibri" w:hAnsi="Calibri" w:cs="Calibri"/>
           <w:i/>
           <w:color w:val="F6F7F1"/>
           <w:spacing w:val="-2"/>
@@ -869,7 +893,7 @@
       </w:r>
       <w:r>
         <w:rPr>
-          <w:rFonts w:ascii="Century Gothic" w:hAnsi="Century Gothic"/>
+          <w:rFonts w:ascii="Calibri" w:hAnsi="Calibri" w:cs="Calibri"/>
           <w:i/>
           <w:color w:val="F6F7F1"/>
           <w:spacing w:val="-2"/>
@@ -878,9 +902,20 @@
         </w:rPr>
         <w:t xml:space="preserve">s </w:t>
       </w:r>
-      <w:r>
-        <w:rPr>
-          <w:rFonts w:ascii="Century Gothic" w:hAnsi="Century Gothic"/>
+    </w:p>
+    <w:p>
+      <w:pPr>
+        <w:spacing w:line="271" w:lineRule="auto"/>
+        <w:ind w:left="29" w:right="547"/>
+        <w:rPr>
+          <w:rFonts w:ascii="Calibri" w:hAnsi="Calibri" w:cs="Calibri"/>
+          <w:sz w:val="20"/>
+          <w:szCs w:val="20"/>
+        </w:rPr>
+      </w:pPr>
+      <w:r>
+        <w:rPr>
+          <w:rFonts w:ascii="Calibri" w:hAnsi="Calibri" w:cs="Calibri"/>
           <w:color w:val="F6F7F1"/>
           <w:sz w:val="20"/>
           <w:szCs w:val="20"/>
@@ -894,41 +929,23 @@
         <w:spacing w:before="13" w:line="256" w:lineRule="auto"/>
         <w:ind w:left="28" w:right="396"/>
         <w:rPr>
-          <w:rFonts w:ascii="Century Gothic" w:hAnsi="Century Gothic"/>
-          <w:sz w:val="20"/>
-          <w:szCs w:val="20"/>
-        </w:rPr>
-      </w:pPr>
-      <w:r>
-        <w:rPr>
-          <w:rFonts w:ascii="Century Gothic" w:hAnsi="Century Gothic"/>
-          <w:color w:val="F6F7F1"/>
-          <w:sz w:val="20"/>
-          <w:szCs w:val="20"/>
-        </w:rPr>
-        <w:t>MyS</w:t>
-      </w:r>
-      <w:r>
-        <w:rPr>
-          <w:rFonts w:ascii="Calibri" w:hAnsi="Calibri" w:cs="Calibri"/>
-          <w:color w:val="F6F7F1"/>
-          <w:sz w:val="20"/>
-          <w:szCs w:val="20"/>
-        </w:rPr>
-        <w:t>Q</w:t>
-      </w:r>
-      <w:r>
-        <w:rPr>
-          <w:rFonts w:ascii="Century Gothic" w:hAnsi="Century Gothic"/>
-          <w:color w:val="F6F7F1"/>
-          <w:sz w:val="20"/>
-          <w:szCs w:val="20"/>
-        </w:rPr>
-        <w:t>L</w:t>
-      </w:r>
-      <w:r>
-        <w:rPr>
-          <w:rFonts w:ascii="Century Gothic" w:hAnsi="Century Gothic"/>
+          <w:rFonts w:ascii="Calibri" w:hAnsi="Calibri" w:cs="Calibri"/>
+          <w:sz w:val="20"/>
+          <w:szCs w:val="20"/>
+        </w:rPr>
+      </w:pPr>
+      <w:r>
+        <w:rPr>
+          <w:rFonts w:ascii="Calibri" w:hAnsi="Calibri" w:cs="Calibri"/>
+          <w:color w:val="F6F7F1"/>
+          <w:sz w:val="20"/>
+          <w:szCs w:val="20"/>
+        </w:rPr>
+        <w:t>MySQL</w:t>
+      </w:r>
+      <w:r>
+        <w:rPr>
+          <w:rFonts w:ascii="Calibri" w:hAnsi="Calibri" w:cs="Calibri"/>
           <w:color w:val="F6F7F1"/>
           <w:spacing w:val="-7"/>
           <w:sz w:val="20"/>
@@ -938,7 +955,7 @@
       </w:r>
       <w:r>
         <w:rPr>
-          <w:rFonts w:ascii="Century Gothic" w:hAnsi="Century Gothic"/>
+          <w:rFonts w:ascii="Calibri" w:hAnsi="Calibri" w:cs="Calibri"/>
           <w:color w:val="F6F7F1"/>
           <w:sz w:val="20"/>
           <w:szCs w:val="20"/>
@@ -947,7 +964,7 @@
       </w:r>
       <w:r>
         <w:rPr>
-          <w:rFonts w:ascii="Century Gothic" w:hAnsi="Century Gothic"/>
+          <w:rFonts w:ascii="Calibri" w:hAnsi="Calibri" w:cs="Calibri"/>
           <w:color w:val="F6F7F1"/>
           <w:spacing w:val="-7"/>
           <w:sz w:val="20"/>
@@ -957,7 +974,7 @@
       </w:r>
       <w:r>
         <w:rPr>
-          <w:rFonts w:ascii="Century Gothic" w:hAnsi="Century Gothic"/>
+          <w:rFonts w:ascii="Calibri" w:hAnsi="Calibri" w:cs="Calibri"/>
           <w:color w:val="F6F7F1"/>
           <w:sz w:val="20"/>
           <w:szCs w:val="20"/>
@@ -966,7 +983,7 @@
       </w:r>
       <w:r>
         <w:rPr>
-          <w:rFonts w:ascii="Century Gothic" w:hAnsi="Century Gothic"/>
+          <w:rFonts w:ascii="Calibri" w:hAnsi="Calibri" w:cs="Calibri"/>
           <w:color w:val="F6F7F1"/>
           <w:spacing w:val="-7"/>
           <w:sz w:val="20"/>
@@ -976,7 +993,7 @@
       </w:r>
       <w:r>
         <w:rPr>
-          <w:rFonts w:ascii="Century Gothic" w:hAnsi="Century Gothic"/>
+          <w:rFonts w:ascii="Calibri" w:hAnsi="Calibri" w:cs="Calibri"/>
           <w:color w:val="F6F7F1"/>
           <w:sz w:val="20"/>
           <w:szCs w:val="20"/>
@@ -985,7 +1002,7 @@
       </w:r>
       <w:r>
         <w:rPr>
-          <w:rFonts w:ascii="Century Gothic" w:hAnsi="Century Gothic"/>
+          <w:rFonts w:ascii="Calibri" w:hAnsi="Calibri" w:cs="Calibri"/>
           <w:color w:val="F6F7F1"/>
           <w:spacing w:val="-4"/>
           <w:sz w:val="20"/>
@@ -995,7 +1012,7 @@
       </w:r>
       <w:r>
         <w:rPr>
-          <w:rFonts w:ascii="Century Gothic" w:hAnsi="Century Gothic"/>
+          <w:rFonts w:ascii="Calibri" w:hAnsi="Calibri" w:cs="Calibri"/>
           <w:color w:val="F6F7F1"/>
           <w:spacing w:val="-16"/>
           <w:sz w:val="20"/>
@@ -1005,7 +1022,7 @@
       </w:r>
       <w:r>
         <w:rPr>
-          <w:rFonts w:ascii="Century Gothic" w:hAnsi="Century Gothic"/>
+          <w:rFonts w:ascii="Calibri" w:hAnsi="Calibri" w:cs="Calibri"/>
           <w:color w:val="F6F7F1"/>
           <w:spacing w:val="-4"/>
           <w:sz w:val="20"/>
@@ -1015,7 +1032,7 @@
       </w:r>
       <w:r>
         <w:rPr>
-          <w:rFonts w:ascii="Century Gothic" w:hAnsi="Century Gothic"/>
+          <w:rFonts w:ascii="Calibri" w:hAnsi="Calibri" w:cs="Calibri"/>
           <w:color w:val="F6F7F1"/>
           <w:spacing w:val="-14"/>
           <w:sz w:val="20"/>
@@ -1025,7 +1042,7 @@
       </w:r>
       <w:r>
         <w:rPr>
-          <w:rFonts w:ascii="Century Gothic" w:hAnsi="Century Gothic"/>
+          <w:rFonts w:ascii="Calibri" w:hAnsi="Calibri" w:cs="Calibri"/>
           <w:color w:val="F6F7F1"/>
           <w:spacing w:val="-4"/>
           <w:sz w:val="20"/>
@@ -1035,7 +1052,7 @@
       </w:r>
       <w:r>
         <w:rPr>
-          <w:rFonts w:ascii="Century Gothic" w:hAnsi="Century Gothic"/>
+          <w:rFonts w:ascii="Calibri" w:hAnsi="Calibri" w:cs="Calibri"/>
           <w:color w:val="F6F7F1"/>
           <w:spacing w:val="-14"/>
           <w:sz w:val="20"/>
@@ -1045,7 +1062,7 @@
       </w:r>
       <w:r>
         <w:rPr>
-          <w:rFonts w:ascii="Century Gothic" w:hAnsi="Century Gothic"/>
+          <w:rFonts w:ascii="Calibri" w:hAnsi="Calibri" w:cs="Calibri"/>
           <w:color w:val="F6F7F1"/>
           <w:spacing w:val="-4"/>
           <w:sz w:val="20"/>
@@ -1055,7 +1072,7 @@
       </w:r>
       <w:r>
         <w:rPr>
-          <w:rFonts w:ascii="Century Gothic" w:hAnsi="Century Gothic"/>
+          <w:rFonts w:ascii="Calibri" w:hAnsi="Calibri" w:cs="Calibri"/>
           <w:color w:val="F6F7F1"/>
           <w:spacing w:val="-2"/>
           <w:sz w:val="20"/>
@@ -1069,54 +1086,52 @@
         <w:spacing w:before="253"/>
         <w:ind w:left="28"/>
         <w:rPr>
-          <w:rFonts w:ascii="Century Gothic" w:hAnsi="Century Gothic"/>
+          <w:rFonts w:ascii="Calibri" w:hAnsi="Calibri" w:cs="Calibri"/>
+          <w:i/>
+          <w:sz w:val="20"/>
+          <w:szCs w:val="20"/>
+        </w:rPr>
+      </w:pPr>
+      <w:r>
+        <w:rPr>
+          <w:rFonts w:ascii="Calibri" w:hAnsi="Calibri" w:cs="Calibri"/>
           <w:b/>
           <w:color w:val="F6F7F1"/>
           <w:spacing w:val="-6"/>
         </w:rPr>
-      </w:pPr>
-      <w:r>
-        <w:rPr>
-          <w:rFonts w:ascii="Century Gothic" w:hAnsi="Century Gothic"/>
+        <w:t>PHP</w:t>
+      </w:r>
+      <w:r>
+        <w:rPr>
+          <w:rFonts w:ascii="Calibri" w:hAnsi="Calibri" w:cs="Calibri"/>
           <w:b/>
           <w:color w:val="F6F7F1"/>
+          <w:spacing w:val="-7"/>
+        </w:rPr>
+        <w:t xml:space="preserve"> </w:t>
+      </w:r>
+      <w:r>
+        <w:rPr>
+          <w:rFonts w:ascii="Calibri" w:hAnsi="Calibri" w:cs="Calibri"/>
+          <w:b/>
+          <w:color w:val="F6F7F1"/>
           <w:spacing w:val="-6"/>
         </w:rPr>
-        <w:t>PHP</w:t>
-      </w:r>
-      <w:r>
-        <w:rPr>
-          <w:rFonts w:ascii="Century Gothic" w:hAnsi="Century Gothic"/>
+        <w:t>Developer</w:t>
+      </w:r>
+      <w:r>
+        <w:rPr>
+          <w:rFonts w:ascii="Calibri" w:hAnsi="Calibri" w:cs="Calibri"/>
           <w:b/>
           <w:color w:val="F6F7F1"/>
-          <w:spacing w:val="-7"/>
-        </w:rPr>
-        <w:t xml:space="preserve"> </w:t>
-      </w:r>
-      <w:r>
-        <w:rPr>
-          <w:rFonts w:ascii="Century Gothic" w:hAnsi="Century Gothic"/>
-          <w:b/>
-          <w:color w:val="F6F7F1"/>
           <w:spacing w:val="-6"/>
         </w:rPr>
-        <w:t xml:space="preserve">Developer, </w:t>
-      </w:r>
-    </w:p>
-    <w:p>
-      <w:pPr>
-        <w:ind w:left="29"/>
-        <w:rPr>
-          <w:rFonts w:ascii="Century Gothic" w:hAnsi="Century Gothic"/>
-          <w:i/>
-          <w:sz w:val="20"/>
-          <w:szCs w:val="20"/>
-        </w:rPr>
-      </w:pPr>
+        <w:t xml:space="preserve">, </w:t>
+      </w:r>
       <w:proofErr w:type="spellStart"/>
       <w:r>
         <w:rPr>
-          <w:rFonts w:ascii="Century Gothic" w:hAnsi="Century Gothic"/>
+          <w:rFonts w:ascii="Calibri" w:hAnsi="Calibri" w:cs="Calibri"/>
           <w:i/>
           <w:color w:val="F6F7F1"/>
           <w:spacing w:val="-6"/>
@@ -1133,14 +1148,14 @@
         <w:spacing w:before="47"/>
         <w:ind w:left="28"/>
         <w:rPr>
-          <w:rFonts w:ascii="Century Gothic" w:hAnsi="Century Gothic"/>
-          <w:sz w:val="20"/>
-          <w:szCs w:val="20"/>
-        </w:rPr>
-      </w:pPr>
-      <w:r>
-        <w:rPr>
-          <w:rFonts w:ascii="Century Gothic" w:hAnsi="Century Gothic"/>
+          <w:rFonts w:ascii="Calibri" w:hAnsi="Calibri" w:cs="Calibri"/>
+          <w:sz w:val="20"/>
+          <w:szCs w:val="20"/>
+        </w:rPr>
+      </w:pPr>
+      <w:r>
+        <w:rPr>
+          <w:rFonts w:ascii="Calibri" w:hAnsi="Calibri" w:cs="Calibri"/>
           <w:color w:val="F6F7F1"/>
           <w:spacing w:val="-4"/>
           <w:sz w:val="20"/>
@@ -1150,7 +1165,7 @@
       </w:r>
       <w:r>
         <w:rPr>
-          <w:rFonts w:ascii="Century Gothic" w:hAnsi="Century Gothic"/>
+          <w:rFonts w:ascii="Calibri" w:hAnsi="Calibri" w:cs="Calibri"/>
           <w:color w:val="F6F7F1"/>
           <w:spacing w:val="-9"/>
           <w:sz w:val="20"/>
@@ -1160,7 +1175,7 @@
       </w:r>
       <w:r>
         <w:rPr>
-          <w:rFonts w:ascii="Century Gothic" w:hAnsi="Century Gothic"/>
+          <w:rFonts w:ascii="Calibri" w:hAnsi="Calibri" w:cs="Calibri"/>
           <w:color w:val="F6F7F1"/>
           <w:spacing w:val="-4"/>
           <w:sz w:val="20"/>
@@ -1170,7 +1185,7 @@
       </w:r>
       <w:r>
         <w:rPr>
-          <w:rFonts w:ascii="Century Gothic" w:hAnsi="Century Gothic"/>
+          <w:rFonts w:ascii="Calibri" w:hAnsi="Calibri" w:cs="Calibri"/>
           <w:color w:val="F6F7F1"/>
           <w:spacing w:val="-9"/>
           <w:sz w:val="20"/>
@@ -1180,7 +1195,7 @@
       </w:r>
       <w:r>
         <w:rPr>
-          <w:rFonts w:ascii="Century Gothic" w:hAnsi="Century Gothic"/>
+          <w:rFonts w:ascii="Calibri" w:hAnsi="Calibri" w:cs="Calibri"/>
           <w:color w:val="F6F7F1"/>
           <w:spacing w:val="-4"/>
           <w:sz w:val="20"/>
@@ -1195,14 +1210,14 @@
         <w:spacing w:before="32" w:line="256" w:lineRule="auto"/>
         <w:ind w:left="28" w:right="88"/>
         <w:rPr>
-          <w:rFonts w:ascii="Century Gothic" w:hAnsi="Century Gothic"/>
-          <w:sz w:val="20"/>
-          <w:szCs w:val="20"/>
-        </w:rPr>
-      </w:pPr>
-      <w:r>
-        <w:rPr>
-          <w:rFonts w:ascii="Century Gothic" w:hAnsi="Century Gothic"/>
+          <w:rFonts w:ascii="Calibri" w:hAnsi="Calibri" w:cs="Calibri"/>
+          <w:sz w:val="20"/>
+          <w:szCs w:val="20"/>
+        </w:rPr>
+      </w:pPr>
+      <w:r>
+        <w:rPr>
+          <w:rFonts w:ascii="Calibri" w:hAnsi="Calibri" w:cs="Calibri"/>
           <w:color w:val="F6F7F1"/>
           <w:sz w:val="20"/>
           <w:szCs w:val="20"/>
@@ -1211,7 +1226,7 @@
       </w:r>
       <w:r>
         <w:rPr>
-          <w:rFonts w:ascii="Century Gothic" w:hAnsi="Century Gothic"/>
+          <w:rFonts w:ascii="Calibri" w:hAnsi="Calibri" w:cs="Calibri"/>
           <w:color w:val="F6F7F1"/>
           <w:sz w:val="20"/>
           <w:szCs w:val="20"/>
@@ -1220,7 +1235,7 @@
       </w:r>
       <w:r>
         <w:rPr>
-          <w:rFonts w:ascii="Century Gothic" w:hAnsi="Century Gothic"/>
+          <w:rFonts w:ascii="Calibri" w:hAnsi="Calibri" w:cs="Calibri"/>
           <w:color w:val="F6F7F1"/>
           <w:sz w:val="20"/>
           <w:szCs w:val="20"/>
@@ -1229,7 +1244,7 @@
       </w:r>
       <w:r>
         <w:rPr>
-          <w:rFonts w:ascii="Century Gothic" w:hAnsi="Century Gothic"/>
+          <w:rFonts w:ascii="Calibri" w:hAnsi="Calibri" w:cs="Calibri"/>
           <w:color w:val="F6F7F1"/>
           <w:spacing w:val="-2"/>
           <w:sz w:val="20"/>
@@ -1239,7 +1254,7 @@
       </w:r>
       <w:r>
         <w:rPr>
-          <w:rFonts w:ascii="Century Gothic" w:hAnsi="Century Gothic"/>
+          <w:rFonts w:ascii="Calibri" w:hAnsi="Calibri" w:cs="Calibri"/>
           <w:color w:val="F6F7F1"/>
           <w:spacing w:val="-14"/>
           <w:sz w:val="20"/>
@@ -1249,7 +1264,7 @@
       </w:r>
       <w:r>
         <w:rPr>
-          <w:rFonts w:ascii="Century Gothic" w:hAnsi="Century Gothic"/>
+          <w:rFonts w:ascii="Calibri" w:hAnsi="Calibri" w:cs="Calibri"/>
           <w:color w:val="F6F7F1"/>
           <w:spacing w:val="-2"/>
           <w:sz w:val="20"/>
@@ -1259,7 +1274,7 @@
       </w:r>
       <w:r>
         <w:rPr>
-          <w:rFonts w:ascii="Century Gothic" w:hAnsi="Century Gothic"/>
+          <w:rFonts w:ascii="Calibri" w:hAnsi="Calibri" w:cs="Calibri"/>
           <w:color w:val="F6F7F1"/>
           <w:spacing w:val="-14"/>
           <w:sz w:val="20"/>
@@ -1269,7 +1284,7 @@
       </w:r>
       <w:r>
         <w:rPr>
-          <w:rFonts w:ascii="Century Gothic" w:hAnsi="Century Gothic"/>
+          <w:rFonts w:ascii="Calibri" w:hAnsi="Calibri" w:cs="Calibri"/>
           <w:color w:val="F6F7F1"/>
           <w:spacing w:val="-2"/>
           <w:sz w:val="20"/>
@@ -1279,7 +1294,7 @@
       </w:r>
       <w:r>
         <w:rPr>
-          <w:rFonts w:ascii="Century Gothic" w:hAnsi="Century Gothic"/>
+          <w:rFonts w:ascii="Calibri" w:hAnsi="Calibri" w:cs="Calibri"/>
           <w:color w:val="F6F7F1"/>
           <w:spacing w:val="-14"/>
           <w:sz w:val="20"/>
@@ -1289,7 +1304,7 @@
       </w:r>
       <w:r>
         <w:rPr>
-          <w:rFonts w:ascii="Century Gothic" w:hAnsi="Century Gothic"/>
+          <w:rFonts w:ascii="Calibri" w:hAnsi="Calibri" w:cs="Calibri"/>
           <w:color w:val="F6F7F1"/>
           <w:spacing w:val="-2"/>
           <w:sz w:val="20"/>
@@ -1299,7 +1314,7 @@
       </w:r>
       <w:r>
         <w:rPr>
-          <w:rFonts w:ascii="Century Gothic" w:hAnsi="Century Gothic"/>
+          <w:rFonts w:ascii="Calibri" w:hAnsi="Calibri" w:cs="Calibri"/>
           <w:color w:val="F6F7F1"/>
           <w:sz w:val="20"/>
           <w:szCs w:val="20"/>
@@ -1308,7 +1323,7 @@
       </w:r>
       <w:r>
         <w:rPr>
-          <w:rFonts w:ascii="Century Gothic" w:hAnsi="Century Gothic"/>
+          <w:rFonts w:ascii="Calibri" w:hAnsi="Calibri" w:cs="Calibri"/>
           <w:color w:val="F6F7F1"/>
           <w:spacing w:val="-14"/>
           <w:sz w:val="20"/>
@@ -1318,7 +1333,7 @@
       </w:r>
       <w:r>
         <w:rPr>
-          <w:rFonts w:ascii="Century Gothic" w:hAnsi="Century Gothic"/>
+          <w:rFonts w:ascii="Calibri" w:hAnsi="Calibri" w:cs="Calibri"/>
           <w:color w:val="F6F7F1"/>
           <w:sz w:val="20"/>
           <w:szCs w:val="20"/>
@@ -1327,7 +1342,7 @@
       </w:r>
       <w:r>
         <w:rPr>
-          <w:rFonts w:ascii="Century Gothic" w:hAnsi="Century Gothic"/>
+          <w:rFonts w:ascii="Calibri" w:hAnsi="Calibri" w:cs="Calibri"/>
           <w:color w:val="F6F7F1"/>
           <w:spacing w:val="-14"/>
           <w:sz w:val="20"/>
@@ -1337,7 +1352,7 @@
       </w:r>
       <w:r>
         <w:rPr>
-          <w:rFonts w:ascii="Century Gothic" w:hAnsi="Century Gothic"/>
+          <w:rFonts w:ascii="Calibri" w:hAnsi="Calibri" w:cs="Calibri"/>
           <w:color w:val="F6F7F1"/>
           <w:sz w:val="20"/>
           <w:szCs w:val="20"/>
@@ -1350,7 +1365,7 @@
         <w:spacing w:before="252" w:line="271" w:lineRule="auto"/>
         <w:ind w:left="28" w:right="340"/>
         <w:rPr>
-          <w:rFonts w:ascii="Century Gothic" w:hAnsi="Century Gothic"/>
+          <w:rFonts w:ascii="Calibri" w:hAnsi="Calibri" w:cs="Calibri"/>
           <w:i/>
           <w:color w:val="F6F7F1"/>
           <w:w w:val="85"/>
@@ -1360,7 +1375,7 @@
       </w:pPr>
       <w:r>
         <w:rPr>
-          <w:rFonts w:ascii="Century Gothic" w:hAnsi="Century Gothic"/>
+          <w:rFonts w:ascii="Calibri" w:hAnsi="Calibri" w:cs="Calibri"/>
           <w:b/>
           <w:color w:val="F6F7F1"/>
         </w:rPr>
@@ -1369,7 +1384,7 @@
       <w:proofErr w:type="spellStart"/>
       <w:r>
         <w:rPr>
-          <w:rFonts w:ascii="Century Gothic" w:hAnsi="Century Gothic"/>
+          <w:rFonts w:ascii="Calibri" w:hAnsi="Calibri" w:cs="Calibri"/>
           <w:i/>
           <w:color w:val="F6F7F1"/>
           <w:w w:val="85"/>
@@ -1380,7 +1395,7 @@
       </w:r>
       <w:r>
         <w:rPr>
-          <w:rFonts w:ascii="Century Gothic" w:hAnsi="Century Gothic"/>
+          <w:rFonts w:ascii="Calibri" w:hAnsi="Calibri" w:cs="Calibri"/>
           <w:i/>
           <w:color w:val="F6F7F1"/>
           <w:w w:val="85"/>
@@ -1392,7 +1407,7 @@
       <w:proofErr w:type="spellEnd"/>
       <w:r>
         <w:rPr>
-          <w:rFonts w:ascii="Century Gothic" w:hAnsi="Century Gothic"/>
+          <w:rFonts w:ascii="Calibri" w:hAnsi="Calibri" w:cs="Calibri"/>
           <w:i/>
           <w:color w:val="F6F7F1"/>
           <w:spacing w:val="-6"/>
@@ -1404,7 +1419,7 @@
       </w:r>
       <w:r>
         <w:rPr>
-          <w:rFonts w:ascii="Century Gothic" w:hAnsi="Century Gothic"/>
+          <w:rFonts w:ascii="Calibri" w:hAnsi="Calibri" w:cs="Calibri"/>
           <w:i/>
           <w:color w:val="F6F7F1"/>
           <w:w w:val="85"/>
@@ -1415,7 +1430,7 @@
       </w:r>
       <w:r>
         <w:rPr>
-          <w:rFonts w:ascii="Century Gothic" w:hAnsi="Century Gothic"/>
+          <w:rFonts w:ascii="Calibri" w:hAnsi="Calibri" w:cs="Calibri"/>
           <w:i/>
           <w:color w:val="F6F7F1"/>
           <w:w w:val="85"/>
@@ -1430,7 +1445,7 @@
         <w:spacing w:line="271" w:lineRule="auto"/>
         <w:ind w:left="29" w:right="346"/>
         <w:rPr>
-          <w:rFonts w:ascii="Century Gothic" w:hAnsi="Century Gothic"/>
+          <w:rFonts w:ascii="Calibri" w:hAnsi="Calibri" w:cs="Calibri"/>
           <w:i/>
           <w:color w:val="F6F7F1"/>
           <w:w w:val="85"/>
@@ -1440,7 +1455,7 @@
       </w:pPr>
       <w:r>
         <w:rPr>
-          <w:rFonts w:ascii="Century Gothic" w:hAnsi="Century Gothic"/>
+          <w:rFonts w:ascii="Calibri" w:hAnsi="Calibri" w:cs="Calibri"/>
           <w:color w:val="F6F7F1"/>
           <w:sz w:val="20"/>
           <w:szCs w:val="20"/>
@@ -1454,14 +1469,14 @@
         <w:spacing w:before="12" w:line="256" w:lineRule="auto"/>
         <w:ind w:left="28"/>
         <w:rPr>
-          <w:rFonts w:ascii="Century Gothic" w:hAnsi="Century Gothic"/>
-          <w:sz w:val="20"/>
-          <w:szCs w:val="20"/>
-        </w:rPr>
-      </w:pPr>
-      <w:r>
-        <w:rPr>
-          <w:rFonts w:ascii="Century Gothic" w:hAnsi="Century Gothic"/>
+          <w:rFonts w:ascii="Calibri" w:hAnsi="Calibri" w:cs="Calibri"/>
+          <w:sz w:val="20"/>
+          <w:szCs w:val="20"/>
+        </w:rPr>
+      </w:pPr>
+      <w:r>
+        <w:rPr>
+          <w:rFonts w:ascii="Calibri" w:hAnsi="Calibri" w:cs="Calibri"/>
           <w:color w:val="F6F7F1"/>
           <w:spacing w:val="-4"/>
           <w:sz w:val="20"/>
@@ -1471,7 +1486,7 @@
       </w:r>
       <w:r>
         <w:rPr>
-          <w:rFonts w:ascii="Century Gothic" w:hAnsi="Century Gothic"/>
+          <w:rFonts w:ascii="Calibri" w:hAnsi="Calibri" w:cs="Calibri"/>
           <w:color w:val="F6F7F1"/>
           <w:spacing w:val="-16"/>
           <w:sz w:val="20"/>
@@ -1481,7 +1496,7 @@
       </w:r>
       <w:r>
         <w:rPr>
-          <w:rFonts w:ascii="Century Gothic" w:hAnsi="Century Gothic"/>
+          <w:rFonts w:ascii="Calibri" w:hAnsi="Calibri" w:cs="Calibri"/>
           <w:color w:val="F6F7F1"/>
           <w:spacing w:val="-4"/>
           <w:sz w:val="20"/>
@@ -1491,7 +1506,7 @@
       </w:r>
       <w:r>
         <w:rPr>
-          <w:rFonts w:ascii="Century Gothic" w:hAnsi="Century Gothic"/>
+          <w:rFonts w:ascii="Calibri" w:hAnsi="Calibri" w:cs="Calibri"/>
           <w:color w:val="F6F7F1"/>
           <w:spacing w:val="-14"/>
           <w:sz w:val="20"/>
@@ -1501,7 +1516,7 @@
       </w:r>
       <w:r>
         <w:rPr>
-          <w:rFonts w:ascii="Century Gothic" w:hAnsi="Century Gothic"/>
+          <w:rFonts w:ascii="Calibri" w:hAnsi="Calibri" w:cs="Calibri"/>
           <w:color w:val="F6F7F1"/>
           <w:spacing w:val="-4"/>
           <w:sz w:val="20"/>
@@ -1511,7 +1526,7 @@
       </w:r>
       <w:r>
         <w:rPr>
-          <w:rFonts w:ascii="Century Gothic" w:hAnsi="Century Gothic"/>
+          <w:rFonts w:ascii="Calibri" w:hAnsi="Calibri" w:cs="Calibri"/>
           <w:color w:val="F6F7F1"/>
           <w:spacing w:val="-14"/>
           <w:sz w:val="20"/>
@@ -1521,7 +1536,7 @@
       </w:r>
       <w:r>
         <w:rPr>
-          <w:rFonts w:ascii="Century Gothic" w:hAnsi="Century Gothic"/>
+          <w:rFonts w:ascii="Calibri" w:hAnsi="Calibri" w:cs="Calibri"/>
           <w:color w:val="F6F7F1"/>
           <w:spacing w:val="-4"/>
           <w:sz w:val="20"/>
@@ -1531,7 +1546,7 @@
       </w:r>
       <w:r>
         <w:rPr>
-          <w:rFonts w:ascii="Century Gothic" w:hAnsi="Century Gothic"/>
+          <w:rFonts w:ascii="Calibri" w:hAnsi="Calibri" w:cs="Calibri"/>
           <w:color w:val="F6F7F1"/>
           <w:spacing w:val="-14"/>
           <w:sz w:val="20"/>
@@ -1541,7 +1556,7 @@
       </w:r>
       <w:r>
         <w:rPr>
-          <w:rFonts w:ascii="Century Gothic" w:hAnsi="Century Gothic"/>
+          <w:rFonts w:ascii="Calibri" w:hAnsi="Calibri" w:cs="Calibri"/>
           <w:color w:val="F6F7F1"/>
           <w:spacing w:val="-4"/>
           <w:sz w:val="20"/>
@@ -1551,7 +1566,7 @@
       </w:r>
       <w:r>
         <w:rPr>
-          <w:rFonts w:ascii="Century Gothic" w:hAnsi="Century Gothic"/>
+          <w:rFonts w:ascii="Calibri" w:hAnsi="Calibri" w:cs="Calibri"/>
           <w:color w:val="F6F7F1"/>
           <w:spacing w:val="-14"/>
           <w:sz w:val="20"/>
@@ -1561,7 +1576,7 @@
       </w:r>
       <w:r>
         <w:rPr>
-          <w:rFonts w:ascii="Century Gothic" w:hAnsi="Century Gothic"/>
+          <w:rFonts w:ascii="Calibri" w:hAnsi="Calibri" w:cs="Calibri"/>
           <w:color w:val="F6F7F1"/>
           <w:spacing w:val="-4"/>
           <w:sz w:val="20"/>
@@ -1571,7 +1586,7 @@
       </w:r>
       <w:r>
         <w:rPr>
-          <w:rFonts w:ascii="Century Gothic" w:hAnsi="Century Gothic"/>
+          <w:rFonts w:ascii="Calibri" w:hAnsi="Calibri" w:cs="Calibri"/>
           <w:color w:val="F6F7F1"/>
           <w:sz w:val="20"/>
           <w:szCs w:val="20"/>
@@ -1580,7 +1595,7 @@
       </w:r>
       <w:r>
         <w:rPr>
-          <w:rFonts w:ascii="Century Gothic" w:hAnsi="Century Gothic"/>
+          <w:rFonts w:ascii="Calibri" w:hAnsi="Calibri" w:cs="Calibri"/>
           <w:color w:val="F6F7F1"/>
           <w:sz w:val="20"/>
           <w:szCs w:val="20"/>
@@ -1589,7 +1604,7 @@
       </w:r>
       <w:r>
         <w:rPr>
-          <w:rFonts w:ascii="Century Gothic" w:hAnsi="Century Gothic"/>
+          <w:rFonts w:ascii="Calibri" w:hAnsi="Calibri" w:cs="Calibri"/>
           <w:color w:val="F6F7F1"/>
           <w:sz w:val="20"/>
           <w:szCs w:val="20"/>
@@ -1598,7 +1613,7 @@
       </w:r>
       <w:r>
         <w:rPr>
-          <w:rFonts w:ascii="Century Gothic" w:hAnsi="Century Gothic"/>
+          <w:rFonts w:ascii="Calibri" w:hAnsi="Calibri" w:cs="Calibri"/>
           <w:color w:val="F6F7F1"/>
           <w:sz w:val="20"/>
           <w:szCs w:val="20"/>
@@ -1607,7 +1622,7 @@
       </w:r>
       <w:r>
         <w:rPr>
-          <w:rFonts w:ascii="Century Gothic" w:hAnsi="Century Gothic"/>
+          <w:rFonts w:ascii="Calibri" w:hAnsi="Calibri" w:cs="Calibri"/>
           <w:color w:val="F6F7F1"/>
           <w:spacing w:val="-14"/>
           <w:sz w:val="20"/>
@@ -1617,7 +1632,7 @@
       </w:r>
       <w:r>
         <w:rPr>
-          <w:rFonts w:ascii="Century Gothic" w:hAnsi="Century Gothic"/>
+          <w:rFonts w:ascii="Calibri" w:hAnsi="Calibri" w:cs="Calibri"/>
           <w:color w:val="F6F7F1"/>
           <w:sz w:val="20"/>
           <w:szCs w:val="20"/>
@@ -1626,7 +1641,7 @@
       </w:r>
       <w:r>
         <w:rPr>
-          <w:rFonts w:ascii="Century Gothic" w:hAnsi="Century Gothic"/>
+          <w:rFonts w:ascii="Calibri" w:hAnsi="Calibri" w:cs="Calibri"/>
           <w:color w:val="F6F7F1"/>
           <w:spacing w:val="-14"/>
           <w:sz w:val="20"/>
@@ -1636,7 +1651,7 @@
       </w:r>
       <w:r>
         <w:rPr>
-          <w:rFonts w:ascii="Century Gothic" w:hAnsi="Century Gothic"/>
+          <w:rFonts w:ascii="Calibri" w:hAnsi="Calibri" w:cs="Calibri"/>
           <w:color w:val="F6F7F1"/>
           <w:sz w:val="20"/>
           <w:szCs w:val="20"/>
@@ -1645,7 +1660,7 @@
       </w:r>
       <w:r>
         <w:rPr>
-          <w:rFonts w:ascii="Century Gothic" w:hAnsi="Century Gothic"/>
+          <w:rFonts w:ascii="Calibri" w:hAnsi="Calibri" w:cs="Calibri"/>
           <w:color w:val="F6F7F1"/>
           <w:spacing w:val="-14"/>
           <w:sz w:val="20"/>
@@ -1655,7 +1670,7 @@
       </w:r>
       <w:r>
         <w:rPr>
-          <w:rFonts w:ascii="Century Gothic" w:hAnsi="Century Gothic"/>
+          <w:rFonts w:ascii="Calibri" w:hAnsi="Calibri" w:cs="Calibri"/>
           <w:color w:val="F6F7F1"/>
           <w:sz w:val="20"/>
           <w:szCs w:val="20"/>
@@ -1664,7 +1679,7 @@
       </w:r>
       <w:r>
         <w:rPr>
-          <w:rFonts w:ascii="Century Gothic" w:hAnsi="Century Gothic"/>
+          <w:rFonts w:ascii="Calibri" w:hAnsi="Calibri" w:cs="Calibri"/>
           <w:color w:val="F6F7F1"/>
           <w:sz w:val="20"/>
           <w:szCs w:val="20"/>
@@ -1673,7 +1688,7 @@
       </w:r>
       <w:r>
         <w:rPr>
-          <w:rFonts w:ascii="Century Gothic" w:hAnsi="Century Gothic"/>
+          <w:rFonts w:ascii="Calibri" w:hAnsi="Calibri" w:cs="Calibri"/>
           <w:color w:val="F6F7F1"/>
           <w:sz w:val="20"/>
           <w:szCs w:val="20"/>
@@ -1681,12 +1696,13 @@
         <w:t xml:space="preserve"> of Database</w:t>
       </w:r>
     </w:p>
+    <w:bookmarkEnd w:id="0"/>
     <w:p>
       <w:pPr>
         <w:pStyle w:val="Heading1"/>
         <w:spacing w:before="189"/>
         <w:rPr>
-          <w:rFonts w:ascii="Century Gothic" w:hAnsi="Century Gothic"/>
+          <w:rFonts w:ascii="Calibri" w:hAnsi="Calibri" w:cs="Calibri"/>
           <w:b w:val="0"/>
           <w:sz w:val="22"/>
           <w:szCs w:val="22"/>
@@ -1694,7 +1710,7 @@
       </w:pPr>
       <w:r>
         <w:rPr>
-          <w:rFonts w:ascii="Century Gothic" w:hAnsi="Century Gothic"/>
+          <w:rFonts w:ascii="Calibri" w:hAnsi="Calibri" w:cs="Calibri"/>
           <w:b w:val="0"/>
           <w:sz w:val="22"/>
           <w:szCs w:val="22"/>
@@ -1707,15 +1723,16 @@
         <w:pStyle w:val="Heading1"/>
         <w:spacing w:before="189"/>
         <w:rPr>
-          <w:rFonts w:ascii="Century Gothic" w:hAnsi="Century Gothic"/>
+          <w:rFonts w:ascii="Calibri" w:hAnsi="Calibri" w:cs="Calibri"/>
           <w:b w:val="0"/>
           <w:sz w:val="40"/>
           <w:szCs w:val="40"/>
         </w:rPr>
       </w:pPr>
-      <w:r>
-        <w:rPr>
-          <w:rFonts w:ascii="Century Gothic" w:hAnsi="Century Gothic"/>
+      <w:bookmarkStart w:id="1" w:name="_Hlk192949526"/>
+      <w:r>
+        <w:rPr>
+          <w:rFonts w:ascii="Calibri" w:hAnsi="Calibri" w:cs="Calibri"/>
           <w:b w:val="0"/>
           <w:sz w:val="40"/>
           <w:szCs w:val="40"/>
@@ -1728,7 +1745,7 @@
         <w:pStyle w:val="Heading1"/>
         <w:ind w:left="29"/>
         <w:rPr>
-          <w:rFonts w:ascii="Century Gothic" w:hAnsi="Century Gothic"/>
+          <w:rFonts w:ascii="Calibri" w:hAnsi="Calibri" w:cs="Calibri"/>
           <w:b w:val="0"/>
           <w:sz w:val="22"/>
           <w:szCs w:val="22"/>
@@ -1736,7 +1753,7 @@
       </w:pPr>
       <w:r>
         <w:rPr>
-          <w:rFonts w:ascii="Century Gothic" w:hAnsi="Century Gothic"/>
+          <w:rFonts w:ascii="Calibri" w:hAnsi="Calibri" w:cs="Calibri"/>
           <w:b w:val="0"/>
           <w:sz w:val="22"/>
           <w:szCs w:val="22"/>
@@ -1749,7 +1766,7 @@
         <w:pStyle w:val="Heading1"/>
         <w:ind w:left="29"/>
         <w:rPr>
-          <w:rFonts w:ascii="Century Gothic" w:hAnsi="Century Gothic"/>
+          <w:rFonts w:ascii="Calibri" w:hAnsi="Calibri" w:cs="Calibri"/>
           <w:b w:val="0"/>
           <w:sz w:val="20"/>
           <w:szCs w:val="20"/>
@@ -1757,7 +1774,7 @@
       </w:pPr>
       <w:r>
         <w:rPr>
-          <w:rFonts w:ascii="Century Gothic" w:hAnsi="Century Gothic"/>
+          <w:rFonts w:ascii="Calibri" w:hAnsi="Calibri" w:cs="Calibri"/>
           <w:b w:val="0"/>
           <w:noProof/>
           <w:sz w:val="22"/>
@@ -1807,25 +1824,16 @@
       </w:r>
       <w:r>
         <w:rPr>
-          <w:rFonts w:ascii="Century Gothic" w:hAnsi="Century Gothic"/>
+          <w:rFonts w:ascii="Calibri" w:hAnsi="Calibri" w:cs="Calibri"/>
           <w:b w:val="0"/>
           <w:sz w:val="20"/>
           <w:szCs w:val="20"/>
         </w:rPr>
-        <w:t>+1</w:t>
-      </w:r>
-      <w:r>
-        <w:rPr>
-          <w:rFonts w:ascii="Century Gothic" w:hAnsi="Century Gothic"/>
-          <w:b w:val="0"/>
-          <w:sz w:val="20"/>
-          <w:szCs w:val="20"/>
-        </w:rPr>
-        <w:t xml:space="preserve">-904-1381-050      </w:t>
-      </w:r>
-      <w:r>
-        <w:rPr>
-          <w:rFonts w:ascii="Century Gothic" w:hAnsi="Century Gothic"/>
+        <w:t xml:space="preserve">+1-904-1381-050      </w:t>
+      </w:r>
+      <w:r>
+        <w:rPr>
+          <w:rFonts w:ascii="Calibri" w:hAnsi="Calibri" w:cs="Calibri"/>
           <w:b w:val="0"/>
           <w:noProof/>
           <w:sz w:val="22"/>
@@ -1875,7 +1883,7 @@
       </w:r>
       <w:r>
         <w:rPr>
-          <w:rFonts w:ascii="Century Gothic" w:hAnsi="Century Gothic"/>
+          <w:rFonts w:ascii="Calibri" w:hAnsi="Calibri" w:cs="Calibri"/>
           <w:b w:val="0"/>
           <w:sz w:val="20"/>
           <w:szCs w:val="20"/>
@@ -1886,7 +1894,7 @@
         <w:r>
           <w:rPr>
             <w:rStyle w:val="Hyperlink"/>
-            <w:rFonts w:ascii="Century Gothic" w:hAnsi="Century Gothic"/>
+            <w:rFonts w:ascii="Calibri" w:hAnsi="Calibri" w:cs="Calibri"/>
             <w:b w:val="0"/>
             <w:color w:val="auto"/>
             <w:sz w:val="20"/>
@@ -1902,7 +1910,7 @@
         <w:pStyle w:val="Heading1"/>
         <w:ind w:left="29"/>
         <w:rPr>
-          <w:rFonts w:ascii="Century Gothic" w:hAnsi="Century Gothic"/>
+          <w:rFonts w:ascii="Calibri" w:hAnsi="Calibri" w:cs="Calibri"/>
           <w:b w:val="0"/>
           <w:sz w:val="22"/>
           <w:szCs w:val="22"/>
@@ -1914,13 +1922,12 @@
         <w:pStyle w:val="Heading1"/>
         <w:spacing w:before="189"/>
         <w:rPr>
-          <w:rFonts w:ascii="Century Gothic" w:hAnsi="Century Gothic"/>
-        </w:rPr>
-      </w:pPr>
-      <w:r>
-        <w:rPr>
-          <w:rFonts w:ascii="Century Gothic" w:hAnsi="Century Gothic"/>
-          <w:color w:val="374B40"/>
+          <w:rFonts w:ascii="Calibri" w:hAnsi="Calibri" w:cs="Calibri"/>
+        </w:rPr>
+      </w:pPr>
+      <w:r>
+        <w:rPr>
+          <w:rFonts w:ascii="Calibri" w:hAnsi="Calibri" w:cs="Calibri"/>
           <w:spacing w:val="-2"/>
         </w:rPr>
         <w:t>Education</w:t>
@@ -1931,22 +1938,21 @@
         <w:spacing w:before="238"/>
         <w:ind w:left="28"/>
         <w:rPr>
-          <w:rFonts w:ascii="Century Gothic" w:hAnsi="Century Gothic"/>
+          <w:rFonts w:ascii="Calibri" w:hAnsi="Calibri" w:cs="Calibri"/>
           <w:b/>
-          <w:color w:val="374B40"/>
           <w:spacing w:val="-4"/>
         </w:rPr>
       </w:pPr>
       <w:r>
         <w:rPr>
-          <w:rFonts w:ascii="Century Gothic" w:hAnsi="Century Gothic"/>
+          <w:rFonts w:ascii="Calibri" w:hAnsi="Calibri" w:cs="Calibri"/>
           <w:b/>
           <w:noProof/>
         </w:rPr>
         <mc:AlternateContent>
           <mc:Choice Requires="wps">
             <w:drawing>
-              <wp:anchor distT="0" distB="0" distL="0" distR="0" simplePos="0" relativeHeight="251590144" behindDoc="0" locked="0" layoutInCell="1" allowOverlap="1" wp14:anchorId="39ED5FDF" wp14:editId="6283B44B">
+              <wp:anchor distT="0" distB="0" distL="0" distR="0" simplePos="0" relativeHeight="251649536" behindDoc="0" locked="0" layoutInCell="1" allowOverlap="1" wp14:anchorId="39ED5FDF" wp14:editId="6283B44B">
                 <wp:simplePos x="0" y="0"/>
                 <wp:positionH relativeFrom="page">
                   <wp:posOffset>3543299</wp:posOffset>
@@ -2017,7 +2023,7 @@
           </mc:Choice>
           <mc:Fallback>
             <w:pict>
-              <v:shape w14:anchorId="0D0DB8C9" id="Graphic 6" o:spid="_x0000_s1026" style="position:absolute;margin-left:279pt;margin-top:1.95pt;width:265.5pt;height:1.5pt;z-index:251590144;visibility:visible;mso-wrap-style:square;mso-wrap-distance-left:0;mso-wrap-distance-top:0;mso-wrap-distance-right:0;mso-wrap-distance-bottom:0;mso-position-horizontal:absolute;mso-position-horizontal-relative:page;mso-position-vertical:absolute;mso-position-vertical-relative:text;v-text-anchor:top" coordsize="3371850,19050" o:gfxdata="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" path="m3371849,19049l,19049,,,3371849,r,19049xe" fillcolor="#374b40" stroked="f">
+              <v:shape w14:anchorId="0BE98492" id="Graphic 6" o:spid="_x0000_s1026" style="position:absolute;margin-left:279pt;margin-top:1.95pt;width:265.5pt;height:1.5pt;z-index:251649536;visibility:visible;mso-wrap-style:square;mso-wrap-distance-left:0;mso-wrap-distance-top:0;mso-wrap-distance-right:0;mso-wrap-distance-bottom:0;mso-position-horizontal:absolute;mso-position-horizontal-relative:page;mso-position-vertical:absolute;mso-position-vertical-relative:text;v-text-anchor:top" coordsize="3371850,19050" o:gfxdata="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" path="m3371849,19049l,19049,,,3371849,r,19049xe" fillcolor="#374b40" stroked="f">
                 <v:path arrowok="t"/>
                 <w10:wrap anchorx="page"/>
               </v:shape>
@@ -2027,9 +2033,8 @@
       </w:r>
       <w:r>
         <w:rPr>
-          <w:rFonts w:ascii="Century Gothic" w:hAnsi="Century Gothic"/>
+          <w:rFonts w:ascii="Calibri" w:hAnsi="Calibri" w:cs="Calibri"/>
           <w:b/>
-          <w:color w:val="374B40"/>
           <w:spacing w:val="-4"/>
         </w:rPr>
         <w:t>Bachelor of Computer Science</w:t>
@@ -2039,11 +2044,10 @@
       <w:pPr>
         <w:ind w:left="29"/>
         <w:rPr>
-          <w:rFonts w:ascii="Century Gothic" w:hAnsi="Century Gothic"/>
+          <w:rFonts w:ascii="Calibri" w:hAnsi="Calibri" w:cs="Calibri"/>
           <w:bCs/>
           <w:i/>
           <w:iCs/>
-          <w:color w:val="374B40"/>
           <w:spacing w:val="-4"/>
           <w:sz w:val="20"/>
           <w:szCs w:val="20"/>
@@ -2051,11 +2055,10 @@
       </w:pPr>
       <w:r>
         <w:rPr>
-          <w:rFonts w:ascii="Century Gothic" w:hAnsi="Century Gothic"/>
+          <w:rFonts w:ascii="Calibri" w:hAnsi="Calibri" w:cs="Calibri"/>
           <w:bCs/>
           <w:i/>
           <w:iCs/>
-          <w:color w:val="374B40"/>
           <w:spacing w:val="-4"/>
           <w:sz w:val="20"/>
           <w:szCs w:val="20"/>
@@ -2067,7 +2070,7 @@
       <w:pPr>
         <w:ind w:left="29"/>
         <w:rPr>
-          <w:rFonts w:ascii="Century Gothic" w:hAnsi="Century Gothic"/>
+          <w:rFonts w:ascii="Calibri" w:hAnsi="Calibri" w:cs="Calibri"/>
           <w:bCs/>
           <w:sz w:val="20"/>
           <w:szCs w:val="20"/>
@@ -2075,42 +2078,18 @@
       </w:pPr>
       <w:r>
         <w:rPr>
-          <w:rFonts w:ascii="Century Gothic" w:hAnsi="Century Gothic"/>
+          <w:rFonts w:ascii="Calibri" w:hAnsi="Calibri" w:cs="Calibri"/>
           <w:bCs/>
-          <w:color w:val="374B40"/>
           <w:spacing w:val="-4"/>
           <w:sz w:val="20"/>
           <w:szCs w:val="20"/>
         </w:rPr>
-        <w:t>06/2002</w:t>
-      </w:r>
-      <w:r>
-        <w:rPr>
-          <w:rFonts w:ascii="Century Gothic" w:hAnsi="Century Gothic"/>
+        <w:t>06/2002 - 05/200</w:t>
+      </w:r>
+      <w:r>
+        <w:rPr>
+          <w:rFonts w:ascii="Calibri" w:hAnsi="Calibri" w:cs="Calibri"/>
           <w:bCs/>
-          <w:color w:val="374B40"/>
-          <w:spacing w:val="-4"/>
-          <w:sz w:val="20"/>
-          <w:szCs w:val="20"/>
-        </w:rPr>
-        <w:t xml:space="preserve"> </w:t>
-      </w:r>
-      <w:r>
-        <w:rPr>
-          <w:rFonts w:ascii="Century Gothic" w:hAnsi="Century Gothic"/>
-          <w:bCs/>
-          <w:color w:val="374B40"/>
-          <w:spacing w:val="-4"/>
-          <w:sz w:val="20"/>
-          <w:szCs w:val="20"/>
-        </w:rPr>
-        <w:t>- 05/200</w:t>
-      </w:r>
-      <w:r>
-        <w:rPr>
-          <w:rFonts w:ascii="Century Gothic" w:hAnsi="Century Gothic"/>
-          <w:bCs/>
-          <w:color w:val="374B40"/>
           <w:spacing w:val="-4"/>
           <w:sz w:val="20"/>
           <w:szCs w:val="20"/>
@@ -2123,17 +2102,15 @@
         <w:spacing w:before="238"/>
         <w:ind w:left="28"/>
         <w:rPr>
-          <w:rFonts w:ascii="Century Gothic" w:hAnsi="Century Gothic"/>
+          <w:rFonts w:ascii="Calibri" w:hAnsi="Calibri" w:cs="Calibri"/>
           <w:b/>
-          <w:color w:val="374B40"/>
           <w:spacing w:val="-4"/>
         </w:rPr>
       </w:pPr>
       <w:r>
         <w:rPr>
-          <w:rFonts w:ascii="Century Gothic" w:hAnsi="Century Gothic"/>
+          <w:rFonts w:ascii="Calibri" w:hAnsi="Calibri" w:cs="Calibri"/>
           <w:b/>
-          <w:color w:val="374B40"/>
           <w:spacing w:val="-4"/>
         </w:rPr>
         <w:t>Post Graduate Diploma in Computer Applications</w:t>
@@ -2143,11 +2120,10 @@
       <w:pPr>
         <w:ind w:left="29"/>
         <w:rPr>
-          <w:rFonts w:ascii="Century Gothic" w:hAnsi="Century Gothic"/>
+          <w:rFonts w:ascii="Calibri" w:hAnsi="Calibri" w:cs="Calibri"/>
           <w:bCs/>
           <w:i/>
           <w:iCs/>
-          <w:color w:val="374B40"/>
           <w:spacing w:val="-4"/>
           <w:sz w:val="20"/>
           <w:szCs w:val="20"/>
@@ -2155,11 +2131,10 @@
       </w:pPr>
       <w:r>
         <w:rPr>
-          <w:rFonts w:ascii="Century Gothic" w:hAnsi="Century Gothic"/>
+          <w:rFonts w:ascii="Calibri" w:hAnsi="Calibri" w:cs="Calibri"/>
           <w:bCs/>
           <w:i/>
           <w:iCs/>
-          <w:color w:val="374B40"/>
           <w:spacing w:val="-4"/>
           <w:sz w:val="20"/>
           <w:szCs w:val="20"/>
@@ -2171,9 +2146,8 @@
       <w:pPr>
         <w:ind w:left="29"/>
         <w:rPr>
-          <w:rFonts w:ascii="Century Gothic" w:hAnsi="Century Gothic"/>
+          <w:rFonts w:ascii="Calibri" w:hAnsi="Calibri" w:cs="Calibri"/>
           <w:bCs/>
-          <w:color w:val="374B40"/>
           <w:spacing w:val="-4"/>
           <w:sz w:val="20"/>
           <w:szCs w:val="20"/>
@@ -2181,70 +2155,129 @@
       </w:pPr>
       <w:r>
         <w:rPr>
-          <w:rFonts w:ascii="Century Gothic" w:hAnsi="Century Gothic"/>
+          <w:rFonts w:ascii="Calibri" w:hAnsi="Calibri" w:cs="Calibri"/>
           <w:bCs/>
-          <w:color w:val="374B40"/>
           <w:spacing w:val="-4"/>
           <w:sz w:val="20"/>
           <w:szCs w:val="20"/>
         </w:rPr>
-        <w:t>06/200</w:t>
-      </w:r>
-      <w:r>
-        <w:rPr>
-          <w:rFonts w:ascii="Century Gothic" w:hAnsi="Century Gothic"/>
+        <w:t>06/2005 - 05/2006</w:t>
+      </w:r>
+    </w:p>
+    <w:p>
+      <w:pPr>
+        <w:ind w:left="29"/>
+        <w:rPr>
+          <w:rFonts w:ascii="Calibri" w:hAnsi="Calibri" w:cs="Calibri"/>
           <w:bCs/>
-          <w:color w:val="374B40"/>
           <w:spacing w:val="-4"/>
           <w:sz w:val="20"/>
           <w:szCs w:val="20"/>
         </w:rPr>
-        <w:t xml:space="preserve">5 </w:t>
-      </w:r>
-      <w:r>
-        <w:rPr>
-          <w:rFonts w:ascii="Century Gothic" w:hAnsi="Century Gothic"/>
+      </w:pPr>
+    </w:p>
+    <w:p>
+      <w:pPr>
+        <w:ind w:left="29"/>
+        <w:rPr>
+          <w:rFonts w:ascii="Calibri" w:hAnsi="Calibri" w:cs="Calibri"/>
+          <w:b/>
+          <w:spacing w:val="-4"/>
+        </w:rPr>
+      </w:pPr>
+      <w:proofErr w:type="gramStart"/>
+      <w:r>
+        <w:rPr>
+          <w:rFonts w:ascii="Calibri" w:hAnsi="Calibri" w:cs="Calibri"/>
+          <w:b/>
+          <w:spacing w:val="-4"/>
+        </w:rPr>
+        <w:t>Master in Computer Science</w:t>
+      </w:r>
+      <w:proofErr w:type="gramEnd"/>
+    </w:p>
+    <w:p>
+      <w:pPr>
+        <w:ind w:left="29"/>
+        <w:rPr>
+          <w:rFonts w:ascii="Calibri" w:hAnsi="Calibri" w:cs="Calibri"/>
           <w:bCs/>
-          <w:color w:val="374B40"/>
           <w:spacing w:val="-4"/>
           <w:sz w:val="20"/>
           <w:szCs w:val="20"/>
         </w:rPr>
-        <w:t>- 05/2006</w:t>
+      </w:pPr>
+      <w:r>
+        <w:rPr>
+          <w:rFonts w:ascii="Calibri" w:hAnsi="Calibri" w:cs="Calibri"/>
+          <w:bCs/>
+          <w:spacing w:val="-4"/>
+          <w:sz w:val="20"/>
+          <w:szCs w:val="20"/>
+        </w:rPr>
+        <w:t>Kurukshetra University</w:t>
       </w:r>
     </w:p>
     <w:p>
       <w:pPr>
         <w:ind w:left="29"/>
         <w:rPr>
-          <w:rFonts w:ascii="Century Gothic" w:hAnsi="Century Gothic"/>
+          <w:rFonts w:ascii="Calibri" w:hAnsi="Calibri" w:cs="Calibri"/>
           <w:bCs/>
-          <w:color w:val="374B40"/>
           <w:spacing w:val="-4"/>
           <w:sz w:val="20"/>
           <w:szCs w:val="20"/>
         </w:rPr>
       </w:pPr>
+      <w:r>
+        <w:rPr>
+          <w:rFonts w:ascii="Calibri" w:hAnsi="Calibri" w:cs="Calibri"/>
+          <w:bCs/>
+          <w:spacing w:val="-4"/>
+          <w:sz w:val="20"/>
+          <w:szCs w:val="20"/>
+        </w:rPr>
+        <w:t>06/2006 – 05/2009</w:t>
+      </w:r>
     </w:p>
     <w:p>
       <w:pPr>
         <w:ind w:left="29"/>
         <w:rPr>
-          <w:rFonts w:ascii="Century Gothic" w:hAnsi="Century Gothic"/>
+          <w:rFonts w:ascii="Calibri" w:hAnsi="Calibri" w:cs="Calibri"/>
+          <w:bCs/>
+          <w:sz w:val="20"/>
+          <w:szCs w:val="20"/>
+        </w:rPr>
+      </w:pPr>
+      <w:r>
+        <w:rPr>
+          <w:rFonts w:ascii="Calibri" w:hAnsi="Calibri" w:cs="Calibri"/>
+          <w:bCs/>
+          <w:spacing w:val="-4"/>
+          <w:sz w:val="20"/>
+          <w:szCs w:val="20"/>
+        </w:rPr>
+        <w:t xml:space="preserve"> </w:t>
+      </w:r>
+    </w:p>
+    <w:p>
+      <w:pPr>
+        <w:ind w:left="29"/>
+        <w:rPr>
+          <w:rFonts w:ascii="Calibri" w:hAnsi="Calibri" w:cs="Calibri"/>
           <w:b/>
-          <w:color w:val="374B40"/>
           <w:spacing w:val="-4"/>
         </w:rPr>
       </w:pPr>
       <w:proofErr w:type="gramStart"/>
       <w:r>
         <w:rPr>
-          <w:rFonts w:ascii="Century Gothic" w:hAnsi="Century Gothic"/>
+          <w:rFonts w:ascii="Calibri" w:hAnsi="Calibri" w:cs="Calibri"/>
           <w:b/>
-          <w:color w:val="374B40"/>
           <w:spacing w:val="-4"/>
         </w:rPr>
-        <w:t>Master in Computer Science</w:t>
+        <w:t>Master in Computer Applications</w:t>
       </w:r>
       <w:proofErr w:type="gramEnd"/>
     </w:p>
@@ -2252,9 +2285,8 @@
       <w:pPr>
         <w:ind w:left="29"/>
         <w:rPr>
-          <w:rFonts w:ascii="Century Gothic" w:hAnsi="Century Gothic"/>
+          <w:rFonts w:ascii="Calibri" w:hAnsi="Calibri" w:cs="Calibri"/>
           <w:bCs/>
-          <w:color w:val="374B40"/>
           <w:spacing w:val="-4"/>
           <w:sz w:val="20"/>
           <w:szCs w:val="20"/>
@@ -2262,9 +2294,8 @@
       </w:pPr>
       <w:r>
         <w:rPr>
-          <w:rFonts w:ascii="Century Gothic" w:hAnsi="Century Gothic"/>
+          <w:rFonts w:ascii="Calibri" w:hAnsi="Calibri" w:cs="Calibri"/>
           <w:bCs/>
-          <w:color w:val="374B40"/>
           <w:spacing w:val="-4"/>
           <w:sz w:val="20"/>
           <w:szCs w:val="20"/>
@@ -2276,9 +2307,8 @@
       <w:pPr>
         <w:ind w:left="29"/>
         <w:rPr>
-          <w:rFonts w:ascii="Century Gothic" w:hAnsi="Century Gothic"/>
+          <w:rFonts w:ascii="Calibri" w:hAnsi="Calibri" w:cs="Calibri"/>
           <w:bCs/>
-          <w:color w:val="374B40"/>
           <w:spacing w:val="-4"/>
           <w:sz w:val="20"/>
           <w:szCs w:val="20"/>
@@ -2286,110 +2316,8 @@
       </w:pPr>
       <w:r>
         <w:rPr>
-          <w:rFonts w:ascii="Century Gothic" w:hAnsi="Century Gothic"/>
+          <w:rFonts w:ascii="Calibri" w:hAnsi="Calibri" w:cs="Calibri"/>
           <w:bCs/>
-          <w:color w:val="374B40"/>
-          <w:spacing w:val="-4"/>
-          <w:sz w:val="20"/>
-          <w:szCs w:val="20"/>
-        </w:rPr>
-        <w:t>06/2006 – 05/2009</w:t>
-      </w:r>
-    </w:p>
-    <w:p>
-      <w:pPr>
-        <w:ind w:left="29"/>
-        <w:rPr>
-          <w:rFonts w:ascii="Century Gothic" w:hAnsi="Century Gothic"/>
-          <w:bCs/>
-          <w:sz w:val="20"/>
-          <w:szCs w:val="20"/>
-        </w:rPr>
-      </w:pPr>
-      <w:r>
-        <w:rPr>
-          <w:rFonts w:ascii="Century Gothic" w:hAnsi="Century Gothic"/>
-          <w:bCs/>
-          <w:color w:val="374B40"/>
-          <w:spacing w:val="-4"/>
-          <w:sz w:val="20"/>
-          <w:szCs w:val="20"/>
-        </w:rPr>
-        <w:t xml:space="preserve"> </w:t>
-      </w:r>
-    </w:p>
-    <w:p>
-      <w:pPr>
-        <w:ind w:left="29"/>
-        <w:rPr>
-          <w:rFonts w:ascii="Century Gothic" w:hAnsi="Century Gothic"/>
-          <w:b/>
-          <w:color w:val="374B40"/>
-          <w:spacing w:val="-4"/>
-        </w:rPr>
-      </w:pPr>
-      <w:proofErr w:type="gramStart"/>
-      <w:r>
-        <w:rPr>
-          <w:rFonts w:ascii="Century Gothic" w:hAnsi="Century Gothic"/>
-          <w:b/>
-          <w:color w:val="374B40"/>
-          <w:spacing w:val="-4"/>
-        </w:rPr>
-        <w:t xml:space="preserve">Master in </w:t>
-      </w:r>
-      <w:r>
-        <w:rPr>
-          <w:rFonts w:ascii="Century Gothic" w:hAnsi="Century Gothic"/>
-          <w:b/>
-          <w:color w:val="374B40"/>
-          <w:spacing w:val="-4"/>
-        </w:rPr>
-        <w:t>Computer Applications</w:t>
-      </w:r>
-      <w:proofErr w:type="gramEnd"/>
-    </w:p>
-    <w:p>
-      <w:pPr>
-        <w:ind w:left="29"/>
-        <w:rPr>
-          <w:rFonts w:ascii="Century Gothic" w:hAnsi="Century Gothic"/>
-          <w:bCs/>
-          <w:color w:val="374B40"/>
-          <w:spacing w:val="-4"/>
-          <w:sz w:val="20"/>
-          <w:szCs w:val="20"/>
-        </w:rPr>
-      </w:pPr>
-      <w:r>
-        <w:rPr>
-          <w:rFonts w:ascii="Century Gothic" w:hAnsi="Century Gothic"/>
-          <w:bCs/>
-          <w:color w:val="374B40"/>
-          <w:spacing w:val="-4"/>
-          <w:sz w:val="20"/>
-          <w:szCs w:val="20"/>
-        </w:rPr>
-        <w:t>Kurukshetra University</w:t>
-      </w:r>
-    </w:p>
-    <w:p>
-      <w:pPr>
-        <w:ind w:left="29"/>
-        <w:rPr>
-          <w:rFonts w:ascii="Century Gothic" w:hAnsi="Century Gothic"/>
-          <w:bCs/>
-          <w:color w:val="374B40"/>
-          <w:spacing w:val="-4"/>
-          <w:sz w:val="20"/>
-          <w:szCs w:val="20"/>
-        </w:rPr>
-      </w:pPr>
-      <w:r>
-        <w:rPr>
-          <w:rFonts w:ascii="Century Gothic" w:hAnsi="Century Gothic"/>
-          <w:bCs/>
-          <w:color w:val="374B40"/>
           <w:spacing w:val="-4"/>
           <w:sz w:val="20"/>
           <w:szCs w:val="20"/>
@@ -2402,7 +2330,7 @@
         <w:pStyle w:val="BodyText"/>
         <w:spacing w:before="240"/>
         <w:rPr>
-          <w:rFonts w:ascii="Century Gothic" w:hAnsi="Century Gothic"/>
+          <w:rFonts w:ascii="Calibri" w:hAnsi="Calibri" w:cs="Calibri"/>
         </w:rPr>
       </w:pPr>
     </w:p>
@@ -2411,20 +2339,20 @@
         <w:spacing w:before="1" w:line="429" w:lineRule="auto"/>
         <w:ind w:left="28" w:right="4680"/>
         <w:rPr>
-          <w:rFonts w:ascii="Century Gothic" w:hAnsi="Century Gothic"/>
-          <w:sz w:val="20"/>
-          <w:szCs w:val="20"/>
-        </w:rPr>
-      </w:pPr>
-      <w:r>
-        <w:rPr>
-          <w:rFonts w:ascii="Century Gothic" w:hAnsi="Century Gothic"/>
+          <w:rFonts w:ascii="Calibri" w:hAnsi="Calibri" w:cs="Calibri"/>
+          <w:sz w:val="20"/>
+          <w:szCs w:val="20"/>
+        </w:rPr>
+      </w:pPr>
+      <w:r>
+        <w:rPr>
+          <w:rFonts w:ascii="Calibri" w:hAnsi="Calibri" w:cs="Calibri"/>
           <w:noProof/>
         </w:rPr>
         <mc:AlternateContent>
           <mc:Choice Requires="wps">
             <w:drawing>
-              <wp:anchor distT="0" distB="0" distL="0" distR="0" simplePos="0" relativeHeight="251591168" behindDoc="0" locked="0" layoutInCell="1" allowOverlap="1" wp14:anchorId="4AC2ADF0" wp14:editId="3901A850">
+              <wp:anchor distT="0" distB="0" distL="0" distR="0" simplePos="0" relativeHeight="251651584" behindDoc="0" locked="0" layoutInCell="1" allowOverlap="1" wp14:anchorId="4AC2ADF0" wp14:editId="3901A850">
                 <wp:simplePos x="0" y="0"/>
                 <wp:positionH relativeFrom="page">
                   <wp:posOffset>3543299</wp:posOffset>
@@ -2495,7 +2423,7 @@
           </mc:Choice>
           <mc:Fallback>
             <w:pict>
-              <v:shape w14:anchorId="78620DF6" id="Graphic 8" o:spid="_x0000_s1026" style="position:absolute;margin-left:279pt;margin-top:15.75pt;width:265.5pt;height:1.5pt;z-index:251591168;visibility:visible;mso-wrap-style:square;mso-wrap-distance-left:0;mso-wrap-distance-top:0;mso-wrap-distance-right:0;mso-wrap-distance-bottom:0;mso-position-horizontal:absolute;mso-position-horizontal-relative:page;mso-position-vertical:absolute;mso-position-vertical-relative:text;v-text-anchor:top" coordsize="3371850,19050" o:gfxdata="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" path="m3371849,19049l,19049,,,3371849,r,19049xe" fillcolor="#374b40" stroked="f">
+              <v:shape w14:anchorId="6E3C911E" id="Graphic 8" o:spid="_x0000_s1026" style="position:absolute;margin-left:279pt;margin-top:15.75pt;width:265.5pt;height:1.5pt;z-index:251651584;visibility:visible;mso-wrap-style:square;mso-wrap-distance-left:0;mso-wrap-distance-top:0;mso-wrap-distance-right:0;mso-wrap-distance-bottom:0;mso-position-horizontal:absolute;mso-position-horizontal-relative:page;mso-position-vertical:absolute;mso-position-vertical-relative:text;v-text-anchor:top" coordsize="3371850,19050" o:gfxdata="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" path="m3371849,19049l,19049,,,3371849,r,19049xe" fillcolor="#374b40" stroked="f">
                 <v:path arrowok="t"/>
                 <w10:wrap anchorx="page"/>
               </v:shape>
@@ -2505,11 +2433,11 @@
       </w:r>
       <w:r>
         <w:rPr>
-          <w:rFonts w:ascii="Century Gothic" w:hAnsi="Century Gothic"/>
+          <w:rFonts w:ascii="Calibri" w:hAnsi="Calibri" w:cs="Calibri"/>
           <w:noProof/>
         </w:rPr>
         <w:drawing>
-          <wp:anchor distT="0" distB="0" distL="0" distR="0" simplePos="0" relativeHeight="251610624" behindDoc="0" locked="0" layoutInCell="1" allowOverlap="1" wp14:anchorId="719D4935" wp14:editId="6316F9B6">
+          <wp:anchor distT="0" distB="0" distL="0" distR="0" simplePos="0" relativeHeight="251653632" behindDoc="0" locked="0" layoutInCell="1" allowOverlap="1" wp14:anchorId="719D4935" wp14:editId="6316F9B6">
             <wp:simplePos x="0" y="0"/>
             <wp:positionH relativeFrom="page">
               <wp:posOffset>6838950</wp:posOffset>
@@ -2554,9 +2482,8 @@
       </w:r>
       <w:r>
         <w:rPr>
-          <w:rFonts w:ascii="Century Gothic" w:hAnsi="Century Gothic"/>
+          <w:rFonts w:ascii="Calibri" w:hAnsi="Calibri" w:cs="Calibri"/>
           <w:b/>
-          <w:color w:val="374B40"/>
           <w:spacing w:val="-2"/>
           <w:sz w:val="24"/>
         </w:rPr>
@@ -2592,14 +2519,14 @@
               <w:pStyle w:val="BodyText"/>
               <w:spacing w:before="28"/>
               <w:rPr>
-                <w:rFonts w:ascii="Century Gothic" w:hAnsi="Century Gothic"/>
+                <w:rFonts w:ascii="Calibri" w:hAnsi="Calibri" w:cs="Calibri"/>
                 <w:sz w:val="20"/>
                 <w:szCs w:val="20"/>
               </w:rPr>
             </w:pPr>
             <w:r>
               <w:rPr>
-                <w:rFonts w:ascii="Century Gothic" w:hAnsi="Century Gothic"/>
+                <w:rFonts w:ascii="Calibri" w:hAnsi="Calibri" w:cs="Calibri"/>
                 <w:sz w:val="20"/>
                 <w:szCs w:val="20"/>
               </w:rPr>
@@ -2617,14 +2544,14 @@
               <w:spacing w:before="28"/>
               <w:jc w:val="right"/>
               <w:rPr>
-                <w:rFonts w:ascii="Century Gothic" w:hAnsi="Century Gothic"/>
+                <w:rFonts w:ascii="Calibri" w:hAnsi="Calibri" w:cs="Calibri"/>
                 <w:sz w:val="20"/>
                 <w:szCs w:val="20"/>
               </w:rPr>
             </w:pPr>
             <w:r>
               <w:rPr>
-                <w:rFonts w:ascii="Century Gothic" w:hAnsi="Century Gothic"/>
+                <w:rFonts w:ascii="Calibri" w:hAnsi="Calibri" w:cs="Calibri"/>
                 <w:sz w:val="20"/>
                 <w:szCs w:val="20"/>
               </w:rPr>
@@ -2643,14 +2570,14 @@
               <w:pStyle w:val="BodyText"/>
               <w:spacing w:before="28"/>
               <w:rPr>
-                <w:rFonts w:ascii="Century Gothic" w:hAnsi="Century Gothic"/>
+                <w:rFonts w:ascii="Calibri" w:hAnsi="Calibri" w:cs="Calibri"/>
                 <w:sz w:val="20"/>
                 <w:szCs w:val="20"/>
               </w:rPr>
             </w:pPr>
             <w:r>
               <w:rPr>
-                <w:rFonts w:ascii="Century Gothic" w:hAnsi="Century Gothic"/>
+                <w:rFonts w:ascii="Calibri" w:hAnsi="Calibri" w:cs="Calibri"/>
                 <w:sz w:val="20"/>
                 <w:szCs w:val="20"/>
               </w:rPr>
@@ -2668,14 +2595,14 @@
               <w:spacing w:before="28"/>
               <w:jc w:val="right"/>
               <w:rPr>
-                <w:rFonts w:ascii="Century Gothic" w:hAnsi="Century Gothic"/>
+                <w:rFonts w:ascii="Calibri" w:hAnsi="Calibri" w:cs="Calibri"/>
                 <w:sz w:val="20"/>
                 <w:szCs w:val="20"/>
               </w:rPr>
             </w:pPr>
             <w:r>
               <w:rPr>
-                <w:rFonts w:ascii="Century Gothic" w:hAnsi="Century Gothic"/>
+                <w:rFonts w:ascii="Calibri" w:hAnsi="Calibri" w:cs="Calibri"/>
                 <w:sz w:val="20"/>
                 <w:szCs w:val="20"/>
               </w:rPr>
@@ -2694,14 +2621,14 @@
               <w:pStyle w:val="BodyText"/>
               <w:spacing w:before="28"/>
               <w:rPr>
-                <w:rFonts w:ascii="Century Gothic" w:hAnsi="Century Gothic"/>
+                <w:rFonts w:ascii="Calibri" w:hAnsi="Calibri" w:cs="Calibri"/>
                 <w:sz w:val="20"/>
                 <w:szCs w:val="20"/>
               </w:rPr>
             </w:pPr>
             <w:r>
               <w:rPr>
-                <w:rFonts w:ascii="Century Gothic" w:hAnsi="Century Gothic"/>
+                <w:rFonts w:ascii="Calibri" w:hAnsi="Calibri" w:cs="Calibri"/>
                 <w:sz w:val="20"/>
                 <w:szCs w:val="20"/>
               </w:rPr>
@@ -2719,14 +2646,14 @@
               <w:spacing w:before="28"/>
               <w:jc w:val="right"/>
               <w:rPr>
-                <w:rFonts w:ascii="Century Gothic" w:hAnsi="Century Gothic"/>
+                <w:rFonts w:ascii="Calibri" w:hAnsi="Calibri" w:cs="Calibri"/>
                 <w:sz w:val="20"/>
                 <w:szCs w:val="20"/>
               </w:rPr>
             </w:pPr>
             <w:r>
               <w:rPr>
-                <w:rFonts w:ascii="Century Gothic" w:hAnsi="Century Gothic"/>
+                <w:rFonts w:ascii="Calibri" w:hAnsi="Calibri" w:cs="Calibri"/>
                 <w:sz w:val="20"/>
                 <w:szCs w:val="20"/>
               </w:rPr>
@@ -2745,14 +2672,14 @@
               <w:pStyle w:val="BodyText"/>
               <w:spacing w:before="28"/>
               <w:rPr>
-                <w:rFonts w:ascii="Century Gothic" w:hAnsi="Century Gothic"/>
+                <w:rFonts w:ascii="Calibri" w:hAnsi="Calibri" w:cs="Calibri"/>
                 <w:sz w:val="20"/>
                 <w:szCs w:val="20"/>
               </w:rPr>
             </w:pPr>
             <w:r>
               <w:rPr>
-                <w:rFonts w:ascii="Century Gothic" w:hAnsi="Century Gothic"/>
+                <w:rFonts w:ascii="Calibri" w:hAnsi="Calibri" w:cs="Calibri"/>
                 <w:sz w:val="20"/>
                 <w:szCs w:val="20"/>
               </w:rPr>
@@ -2770,14 +2697,14 @@
               <w:spacing w:before="28"/>
               <w:jc w:val="right"/>
               <w:rPr>
-                <w:rFonts w:ascii="Century Gothic" w:hAnsi="Century Gothic"/>
+                <w:rFonts w:ascii="Calibri" w:hAnsi="Calibri" w:cs="Calibri"/>
                 <w:sz w:val="20"/>
                 <w:szCs w:val="20"/>
               </w:rPr>
             </w:pPr>
             <w:r>
               <w:rPr>
-                <w:rFonts w:ascii="Century Gothic" w:hAnsi="Century Gothic"/>
+                <w:rFonts w:ascii="Calibri" w:hAnsi="Calibri" w:cs="Calibri"/>
                 <w:sz w:val="20"/>
                 <w:szCs w:val="20"/>
               </w:rPr>
@@ -2796,14 +2723,14 @@
               <w:pStyle w:val="BodyText"/>
               <w:spacing w:before="28"/>
               <w:rPr>
-                <w:rFonts w:ascii="Century Gothic" w:hAnsi="Century Gothic"/>
+                <w:rFonts w:ascii="Calibri" w:hAnsi="Calibri" w:cs="Calibri"/>
                 <w:sz w:val="20"/>
                 <w:szCs w:val="20"/>
               </w:rPr>
             </w:pPr>
             <w:r>
               <w:rPr>
-                <w:rFonts w:ascii="Century Gothic" w:hAnsi="Century Gothic"/>
+                <w:rFonts w:ascii="Calibri" w:hAnsi="Calibri" w:cs="Calibri"/>
                 <w:sz w:val="20"/>
                 <w:szCs w:val="20"/>
               </w:rPr>
@@ -2821,14 +2748,14 @@
               <w:spacing w:before="28"/>
               <w:jc w:val="right"/>
               <w:rPr>
-                <w:rFonts w:ascii="Century Gothic" w:hAnsi="Century Gothic"/>
+                <w:rFonts w:ascii="Calibri" w:hAnsi="Calibri" w:cs="Calibri"/>
                 <w:sz w:val="20"/>
                 <w:szCs w:val="20"/>
               </w:rPr>
             </w:pPr>
             <w:r>
               <w:rPr>
-                <w:rFonts w:ascii="Century Gothic" w:hAnsi="Century Gothic"/>
+                <w:rFonts w:ascii="Calibri" w:hAnsi="Calibri" w:cs="Calibri"/>
                 <w:sz w:val="20"/>
                 <w:szCs w:val="20"/>
               </w:rPr>
@@ -2847,7 +2774,7 @@
               <w:pStyle w:val="BodyText"/>
               <w:spacing w:before="28"/>
               <w:rPr>
-                <w:rFonts w:ascii="Century Gothic" w:hAnsi="Century Gothic"/>
+                <w:rFonts w:ascii="Calibri" w:hAnsi="Calibri" w:cs="Calibri"/>
                 <w:sz w:val="20"/>
                 <w:szCs w:val="20"/>
               </w:rPr>
@@ -2855,7 +2782,7 @@
             <w:proofErr w:type="spellStart"/>
             <w:r>
               <w:rPr>
-                <w:rFonts w:ascii="Century Gothic" w:hAnsi="Century Gothic"/>
+                <w:rFonts w:ascii="Calibri" w:hAnsi="Calibri" w:cs="Calibri"/>
                 <w:sz w:val="20"/>
                 <w:szCs w:val="20"/>
               </w:rPr>
@@ -2874,14 +2801,14 @@
               <w:spacing w:before="28"/>
               <w:jc w:val="right"/>
               <w:rPr>
-                <w:rFonts w:ascii="Century Gothic" w:hAnsi="Century Gothic"/>
+                <w:rFonts w:ascii="Calibri" w:hAnsi="Calibri" w:cs="Calibri"/>
                 <w:sz w:val="20"/>
                 <w:szCs w:val="20"/>
               </w:rPr>
             </w:pPr>
             <w:r>
               <w:rPr>
-                <w:rFonts w:ascii="Century Gothic" w:hAnsi="Century Gothic"/>
+                <w:rFonts w:ascii="Calibri" w:hAnsi="Calibri" w:cs="Calibri"/>
                 <w:sz w:val="20"/>
                 <w:szCs w:val="20"/>
               </w:rPr>
@@ -2900,14 +2827,14 @@
               <w:pStyle w:val="BodyText"/>
               <w:spacing w:before="28"/>
               <w:rPr>
-                <w:rFonts w:ascii="Century Gothic" w:hAnsi="Century Gothic"/>
+                <w:rFonts w:ascii="Calibri" w:hAnsi="Calibri" w:cs="Calibri"/>
                 <w:sz w:val="20"/>
                 <w:szCs w:val="20"/>
               </w:rPr>
             </w:pPr>
             <w:r>
               <w:rPr>
-                <w:rFonts w:ascii="Century Gothic" w:hAnsi="Century Gothic"/>
+                <w:rFonts w:ascii="Calibri" w:hAnsi="Calibri" w:cs="Calibri"/>
                 <w:sz w:val="20"/>
                 <w:szCs w:val="20"/>
               </w:rPr>
@@ -2925,14 +2852,14 @@
               <w:spacing w:before="28"/>
               <w:jc w:val="right"/>
               <w:rPr>
-                <w:rFonts w:ascii="Century Gothic" w:hAnsi="Century Gothic"/>
+                <w:rFonts w:ascii="Calibri" w:hAnsi="Calibri" w:cs="Calibri"/>
                 <w:sz w:val="20"/>
                 <w:szCs w:val="20"/>
               </w:rPr>
             </w:pPr>
             <w:r>
               <w:rPr>
-                <w:rFonts w:ascii="Century Gothic" w:hAnsi="Century Gothic"/>
+                <w:rFonts w:ascii="Calibri" w:hAnsi="Calibri" w:cs="Calibri"/>
                 <w:sz w:val="20"/>
                 <w:szCs w:val="20"/>
               </w:rPr>
@@ -2947,7 +2874,7 @@
         <w:pStyle w:val="BodyText"/>
         <w:spacing w:before="28"/>
         <w:rPr>
-          <w:rFonts w:ascii="Century Gothic" w:hAnsi="Century Gothic"/>
+          <w:rFonts w:ascii="Calibri" w:hAnsi="Calibri" w:cs="Calibri"/>
           <w:sz w:val="20"/>
           <w:szCs w:val="20"/>
         </w:rPr>
@@ -2958,7 +2885,7 @@
         <w:pStyle w:val="BodyText"/>
         <w:spacing w:before="28"/>
         <w:rPr>
-          <w:rFonts w:ascii="Century Gothic" w:hAnsi="Century Gothic"/>
+          <w:rFonts w:ascii="Calibri" w:hAnsi="Calibri" w:cs="Calibri"/>
           <w:sz w:val="20"/>
           <w:szCs w:val="20"/>
         </w:rPr>
@@ -2969,18 +2896,18 @@
         <w:pStyle w:val="Heading1"/>
         <w:ind w:left="0"/>
         <w:rPr>
-          <w:rFonts w:ascii="Century Gothic" w:hAnsi="Century Gothic"/>
-        </w:rPr>
-      </w:pPr>
-      <w:r>
-        <w:rPr>
-          <w:rFonts w:ascii="Century Gothic" w:hAnsi="Century Gothic"/>
+          <w:rFonts w:ascii="Calibri" w:hAnsi="Calibri" w:cs="Calibri"/>
+        </w:rPr>
+      </w:pPr>
+      <w:r>
+        <w:rPr>
+          <w:rFonts w:ascii="Calibri" w:hAnsi="Calibri" w:cs="Calibri"/>
           <w:noProof/>
         </w:rPr>
         <mc:AlternateContent>
           <mc:Choice Requires="wps">
             <w:drawing>
-              <wp:anchor distT="0" distB="0" distL="0" distR="0" simplePos="0" relativeHeight="251690496" behindDoc="0" locked="0" layoutInCell="1" allowOverlap="1" wp14:anchorId="0C5B1CEA" wp14:editId="675F0129">
+              <wp:anchor distT="0" distB="0" distL="0" distR="0" simplePos="0" relativeHeight="251655680" behindDoc="0" locked="0" layoutInCell="1" allowOverlap="1" wp14:anchorId="0C5B1CEA" wp14:editId="675F0129">
                 <wp:simplePos x="0" y="0"/>
                 <wp:positionH relativeFrom="page">
                   <wp:posOffset>3542665</wp:posOffset>
@@ -3054,7 +2981,7 @@
           </mc:Choice>
           <mc:Fallback>
             <w:pict>
-              <v:shape w14:anchorId="49BB7B8F" id="Graphic 44" o:spid="_x0000_s1026" style="position:absolute;margin-left:278.95pt;margin-top:14.7pt;width:265.5pt;height:1.5pt;z-index:251690496;visibility:visible;mso-wrap-style:square;mso-height-percent:0;mso-wrap-distance-left:0;mso-wrap-distance-top:0;mso-wrap-distance-right:0;mso-wrap-distance-bottom:0;mso-position-horizontal:absolute;mso-position-horizontal-relative:page;mso-position-vertical:absolute;mso-position-vertical-relative:text;mso-height-percent:0;mso-height-relative:margin;v-text-anchor:top" coordsize="3371850,19050" o:gfxdata="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" path="m3371849,19049l,19049,,,3371849,r,19049xe" fillcolor="#374b40" stroked="f">
+              <v:shape w14:anchorId="53FFEF7F" id="Graphic 44" o:spid="_x0000_s1026" style="position:absolute;margin-left:278.95pt;margin-top:14.7pt;width:265.5pt;height:1.5pt;z-index:251655680;visibility:visible;mso-wrap-style:square;mso-height-percent:0;mso-wrap-distance-left:0;mso-wrap-distance-top:0;mso-wrap-distance-right:0;mso-wrap-distance-bottom:0;mso-position-horizontal:absolute;mso-position-horizontal-relative:page;mso-position-vertical:absolute;mso-position-vertical-relative:text;mso-height-percent:0;mso-height-relative:margin;v-text-anchor:top" coordsize="3371850,19050" o:gfxdata="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" path="m3371849,19049l,19049,,,3371849,r,19049xe" fillcolor="#374b40" stroked="f">
                 <v:path arrowok="t"/>
                 <w10:wrap anchorx="page"/>
               </v:shape>
@@ -3064,16 +2991,14 @@
       </w:r>
       <w:r>
         <w:rPr>
-          <w:rFonts w:ascii="Century Gothic" w:hAnsi="Century Gothic"/>
-          <w:color w:val="374B40"/>
+          <w:rFonts w:ascii="Calibri" w:hAnsi="Calibri" w:cs="Calibri"/>
           <w:spacing w:val="-2"/>
         </w:rPr>
         <w:t xml:space="preserve"> </w:t>
       </w:r>
       <w:r>
         <w:rPr>
-          <w:rFonts w:ascii="Century Gothic" w:hAnsi="Century Gothic"/>
-          <w:color w:val="374B40"/>
+          <w:rFonts w:ascii="Calibri" w:hAnsi="Calibri" w:cs="Calibri"/>
           <w:spacing w:val="-2"/>
         </w:rPr>
         <w:t>Interests</w:t>
@@ -3085,15 +3010,14 @@
         <w:spacing w:before="267" w:line="312" w:lineRule="auto"/>
         <w:ind w:left="28"/>
         <w:rPr>
-          <w:rFonts w:ascii="Century Gothic" w:hAnsi="Century Gothic"/>
-          <w:sz w:val="20"/>
-          <w:szCs w:val="20"/>
-        </w:rPr>
-      </w:pPr>
-      <w:r>
-        <w:rPr>
-          <w:rFonts w:ascii="Century Gothic" w:hAnsi="Century Gothic"/>
-          <w:color w:val="374B40"/>
+          <w:rFonts w:ascii="Calibri" w:hAnsi="Calibri" w:cs="Calibri"/>
+          <w:sz w:val="20"/>
+          <w:szCs w:val="20"/>
+        </w:rPr>
+      </w:pPr>
+      <w:r>
+        <w:rPr>
+          <w:rFonts w:ascii="Calibri" w:hAnsi="Calibri" w:cs="Calibri"/>
           <w:spacing w:val="-4"/>
           <w:sz w:val="20"/>
           <w:szCs w:val="20"/>
@@ -3102,8 +3026,7 @@
       </w:r>
       <w:r>
         <w:rPr>
-          <w:rFonts w:ascii="Century Gothic" w:hAnsi="Century Gothic"/>
-          <w:color w:val="374B40"/>
+          <w:rFonts w:ascii="Calibri" w:hAnsi="Calibri" w:cs="Calibri"/>
           <w:spacing w:val="-8"/>
           <w:sz w:val="20"/>
           <w:szCs w:val="20"/>
@@ -3112,8 +3035,7 @@
       </w:r>
       <w:r>
         <w:rPr>
-          <w:rFonts w:ascii="Century Gothic" w:hAnsi="Century Gothic"/>
-          <w:color w:val="374B40"/>
+          <w:rFonts w:ascii="Calibri" w:hAnsi="Calibri" w:cs="Calibri"/>
           <w:spacing w:val="-4"/>
           <w:sz w:val="20"/>
           <w:szCs w:val="20"/>
@@ -3122,8 +3044,7 @@
       </w:r>
       <w:r>
         <w:rPr>
-          <w:rFonts w:ascii="Century Gothic" w:hAnsi="Century Gothic"/>
-          <w:color w:val="374B40"/>
+          <w:rFonts w:ascii="Calibri" w:hAnsi="Calibri" w:cs="Calibri"/>
           <w:spacing w:val="-8"/>
           <w:sz w:val="20"/>
           <w:szCs w:val="20"/>
@@ -3132,8 +3053,7 @@
       </w:r>
       <w:r>
         <w:rPr>
-          <w:rFonts w:ascii="Century Gothic" w:hAnsi="Century Gothic"/>
-          <w:color w:val="374B40"/>
+          <w:rFonts w:ascii="Calibri" w:hAnsi="Calibri" w:cs="Calibri"/>
           <w:spacing w:val="-4"/>
           <w:sz w:val="20"/>
           <w:szCs w:val="20"/>
@@ -3142,8 +3062,7 @@
       </w:r>
       <w:r>
         <w:rPr>
-          <w:rFonts w:ascii="Century Gothic" w:hAnsi="Century Gothic"/>
-          <w:color w:val="374B40"/>
+          <w:rFonts w:ascii="Calibri" w:hAnsi="Calibri" w:cs="Calibri"/>
           <w:spacing w:val="-8"/>
           <w:sz w:val="20"/>
           <w:szCs w:val="20"/>
@@ -3152,8 +3071,7 @@
       </w:r>
       <w:r>
         <w:rPr>
-          <w:rFonts w:ascii="Century Gothic" w:hAnsi="Century Gothic"/>
-          <w:color w:val="374B40"/>
+          <w:rFonts w:ascii="Calibri" w:hAnsi="Calibri" w:cs="Calibri"/>
           <w:spacing w:val="-4"/>
           <w:sz w:val="20"/>
           <w:szCs w:val="20"/>
@@ -3162,8 +3080,7 @@
       </w:r>
       <w:r>
         <w:rPr>
-          <w:rFonts w:ascii="Century Gothic" w:hAnsi="Century Gothic"/>
-          <w:color w:val="374B40"/>
+          <w:rFonts w:ascii="Calibri" w:hAnsi="Calibri" w:cs="Calibri"/>
           <w:spacing w:val="-8"/>
           <w:sz w:val="20"/>
           <w:szCs w:val="20"/>
@@ -3172,8 +3089,7 @@
       </w:r>
       <w:r>
         <w:rPr>
-          <w:rFonts w:ascii="Century Gothic" w:hAnsi="Century Gothic"/>
-          <w:color w:val="374B40"/>
+          <w:rFonts w:ascii="Calibri" w:hAnsi="Calibri" w:cs="Calibri"/>
           <w:spacing w:val="-4"/>
           <w:sz w:val="20"/>
           <w:szCs w:val="20"/>
@@ -3182,8 +3098,7 @@
       </w:r>
       <w:r>
         <w:rPr>
-          <w:rFonts w:ascii="Century Gothic" w:hAnsi="Century Gothic"/>
-          <w:color w:val="374B40"/>
+          <w:rFonts w:ascii="Calibri" w:hAnsi="Calibri" w:cs="Calibri"/>
           <w:spacing w:val="-8"/>
           <w:sz w:val="20"/>
           <w:szCs w:val="20"/>
@@ -3192,8 +3107,7 @@
       </w:r>
       <w:r>
         <w:rPr>
-          <w:rFonts w:ascii="Century Gothic" w:hAnsi="Century Gothic"/>
-          <w:color w:val="374B40"/>
+          <w:rFonts w:ascii="Calibri" w:hAnsi="Calibri" w:cs="Calibri"/>
           <w:spacing w:val="-4"/>
           <w:sz w:val="20"/>
           <w:szCs w:val="20"/>
@@ -3202,8 +3116,7 @@
       </w:r>
       <w:r>
         <w:rPr>
-          <w:rFonts w:ascii="Century Gothic" w:hAnsi="Century Gothic"/>
-          <w:color w:val="374B40"/>
+          <w:rFonts w:ascii="Calibri" w:hAnsi="Calibri" w:cs="Calibri"/>
           <w:spacing w:val="-8"/>
           <w:sz w:val="20"/>
           <w:szCs w:val="20"/>
@@ -3212,8 +3125,7 @@
       </w:r>
       <w:r>
         <w:rPr>
-          <w:rFonts w:ascii="Century Gothic" w:hAnsi="Century Gothic"/>
-          <w:color w:val="374B40"/>
+          <w:rFonts w:ascii="Calibri" w:hAnsi="Calibri" w:cs="Calibri"/>
           <w:spacing w:val="-4"/>
           <w:sz w:val="20"/>
           <w:szCs w:val="20"/>
@@ -3222,8 +3134,7 @@
       </w:r>
       <w:r>
         <w:rPr>
-          <w:rFonts w:ascii="Century Gothic" w:hAnsi="Century Gothic"/>
-          <w:color w:val="374B40"/>
+          <w:rFonts w:ascii="Calibri" w:hAnsi="Calibri" w:cs="Calibri"/>
           <w:sz w:val="20"/>
           <w:szCs w:val="20"/>
         </w:rPr>
@@ -3231,8 +3142,7 @@
       </w:r>
       <w:r>
         <w:rPr>
-          <w:rFonts w:ascii="Century Gothic" w:hAnsi="Century Gothic"/>
-          <w:color w:val="374B40"/>
+          <w:rFonts w:ascii="Calibri" w:hAnsi="Calibri" w:cs="Calibri"/>
           <w:spacing w:val="-14"/>
           <w:sz w:val="20"/>
           <w:szCs w:val="20"/>
@@ -3241,8 +3151,7 @@
       </w:r>
       <w:r>
         <w:rPr>
-          <w:rFonts w:ascii="Century Gothic" w:hAnsi="Century Gothic"/>
-          <w:color w:val="374B40"/>
+          <w:rFonts w:ascii="Calibri" w:hAnsi="Calibri" w:cs="Calibri"/>
           <w:sz w:val="20"/>
           <w:szCs w:val="20"/>
         </w:rPr>
@@ -3254,7 +3163,7 @@
         <w:pStyle w:val="BodyText"/>
         <w:spacing w:before="166"/>
         <w:rPr>
-          <w:rFonts w:ascii="Century Gothic" w:hAnsi="Century Gothic"/>
+          <w:rFonts w:ascii="Calibri" w:hAnsi="Calibri" w:cs="Calibri"/>
         </w:rPr>
       </w:pPr>
     </w:p>
@@ -3262,14 +3171,14 @@
       <w:pPr>
         <w:pStyle w:val="Heading1"/>
         <w:rPr>
-          <w:rFonts w:ascii="Century Gothic" w:hAnsi="Century Gothic"/>
+          <w:rFonts w:ascii="Calibri" w:hAnsi="Calibri" w:cs="Calibri"/>
           <w:sz w:val="22"/>
           <w:szCs w:val="22"/>
         </w:rPr>
       </w:pPr>
       <w:r>
         <w:rPr>
-          <w:rFonts w:ascii="Century Gothic" w:hAnsi="Century Gothic"/>
+          <w:rFonts w:ascii="Calibri" w:hAnsi="Calibri" w:cs="Calibri"/>
           <w:noProof/>
           <w:sz w:val="22"/>
           <w:szCs w:val="22"/>
@@ -3277,7 +3186,7 @@
         <mc:AlternateContent>
           <mc:Choice Requires="wps">
             <w:drawing>
-              <wp:anchor distT="0" distB="0" distL="0" distR="0" simplePos="0" relativeHeight="251692544" behindDoc="0" locked="0" layoutInCell="1" allowOverlap="1" wp14:anchorId="70D4738A" wp14:editId="21616C7F">
+              <wp:anchor distT="0" distB="0" distL="0" distR="0" simplePos="0" relativeHeight="251657728" behindDoc="0" locked="0" layoutInCell="1" allowOverlap="1" wp14:anchorId="70D4738A" wp14:editId="21616C7F">
                 <wp:simplePos x="0" y="0"/>
                 <wp:positionH relativeFrom="page">
                   <wp:posOffset>3543299</wp:posOffset>
@@ -3348,7 +3257,7 @@
           </mc:Choice>
           <mc:Fallback>
             <w:pict>
-              <v:shape w14:anchorId="79C9E24E" id="Graphic 45" o:spid="_x0000_s1026" style="position:absolute;margin-left:279pt;margin-top:15.7pt;width:265.5pt;height:1.5pt;z-index:251692544;visibility:visible;mso-wrap-style:square;mso-wrap-distance-left:0;mso-wrap-distance-top:0;mso-wrap-distance-right:0;mso-wrap-distance-bottom:0;mso-position-horizontal:absolute;mso-position-horizontal-relative:page;mso-position-vertical:absolute;mso-position-vertical-relative:text;v-text-anchor:top" coordsize="3371850,19050" o:gfxdata="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" path="m3371849,19049l,19049,,,3371849,r,19049xe" fillcolor="#374b40" stroked="f">
+              <v:shape w14:anchorId="371EB013" id="Graphic 45" o:spid="_x0000_s1026" style="position:absolute;margin-left:279pt;margin-top:15.7pt;width:265.5pt;height:1.5pt;z-index:251657728;visibility:visible;mso-wrap-style:square;mso-wrap-distance-left:0;mso-wrap-distance-top:0;mso-wrap-distance-right:0;mso-wrap-distance-bottom:0;mso-position-horizontal:absolute;mso-position-horizontal-relative:page;mso-position-vertical:absolute;mso-position-vertical-relative:text;v-text-anchor:top" coordsize="3371850,19050" o:gfxdata="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" path="m3371849,19049l,19049,,,3371849,r,19049xe" fillcolor="#374b40" stroked="f">
                 <v:path arrowok="t"/>
                 <w10:wrap anchorx="page"/>
               </v:shape>
@@ -3358,8 +3267,7 @@
       </w:r>
       <w:r>
         <w:rPr>
-          <w:rFonts w:ascii="Century Gothic" w:hAnsi="Century Gothic"/>
-          <w:color w:val="374B40"/>
+          <w:rFonts w:ascii="Calibri" w:hAnsi="Calibri" w:cs="Calibri"/>
           <w:spacing w:val="-2"/>
           <w:sz w:val="22"/>
           <w:szCs w:val="22"/>
@@ -3372,7 +3280,7 @@
         <w:pStyle w:val="Heading1"/>
         <w:ind w:left="0"/>
         <w:rPr>
-          <w:rFonts w:ascii="Century Gothic" w:hAnsi="Century Gothic"/>
+          <w:rFonts w:ascii="Calibri" w:hAnsi="Calibri" w:cs="Calibri"/>
         </w:rPr>
       </w:pPr>
     </w:p>
@@ -3384,7 +3292,7 @@
           <w:numId w:val="2"/>
         </w:numPr>
         <w:rPr>
-          <w:rFonts w:ascii="Century Gothic" w:hAnsi="Century Gothic"/>
+          <w:rFonts w:ascii="Calibri" w:hAnsi="Calibri" w:cs="Calibri"/>
           <w:b w:val="0"/>
           <w:bCs w:val="0"/>
           <w:sz w:val="20"/>
@@ -3393,7 +3301,7 @@
       </w:pPr>
       <w:r>
         <w:rPr>
-          <w:rFonts w:ascii="Century Gothic" w:hAnsi="Century Gothic"/>
+          <w:rFonts w:ascii="Calibri" w:hAnsi="Calibri" w:cs="Calibri"/>
           <w:b w:val="0"/>
           <w:bCs w:val="0"/>
           <w:sz w:val="20"/>
@@ -3410,7 +3318,7 @@
           <w:numId w:val="2"/>
         </w:numPr>
         <w:rPr>
-          <w:rFonts w:ascii="Century Gothic" w:hAnsi="Century Gothic"/>
+          <w:rFonts w:ascii="Calibri" w:hAnsi="Calibri" w:cs="Calibri"/>
           <w:b w:val="0"/>
           <w:bCs w:val="0"/>
           <w:sz w:val="20"/>
@@ -3419,7 +3327,7 @@
       </w:pPr>
       <w:r>
         <w:rPr>
-          <w:rFonts w:ascii="Century Gothic" w:hAnsi="Century Gothic"/>
+          <w:rFonts w:ascii="Calibri" w:hAnsi="Calibri" w:cs="Calibri"/>
           <w:b w:val="0"/>
           <w:bCs w:val="0"/>
           <w:sz w:val="20"/>
@@ -3436,7 +3344,7 @@
           <w:numId w:val="2"/>
         </w:numPr>
         <w:rPr>
-          <w:rFonts w:ascii="Century Gothic" w:hAnsi="Century Gothic"/>
+          <w:rFonts w:ascii="Calibri" w:hAnsi="Calibri" w:cs="Calibri"/>
           <w:b w:val="0"/>
           <w:bCs w:val="0"/>
           <w:sz w:val="20"/>
@@ -3445,7 +3353,7 @@
       </w:pPr>
       <w:r>
         <w:rPr>
-          <w:rFonts w:ascii="Century Gothic" w:hAnsi="Century Gothic"/>
+          <w:rFonts w:ascii="Calibri" w:hAnsi="Calibri" w:cs="Calibri"/>
           <w:b w:val="0"/>
           <w:bCs w:val="0"/>
           <w:sz w:val="20"/>
@@ -3462,7 +3370,7 @@
           <w:numId w:val="2"/>
         </w:numPr>
         <w:rPr>
-          <w:rFonts w:ascii="Century Gothic" w:hAnsi="Century Gothic"/>
+          <w:rFonts w:ascii="Calibri" w:hAnsi="Calibri" w:cs="Calibri"/>
           <w:b w:val="0"/>
           <w:bCs w:val="0"/>
           <w:sz w:val="20"/>
@@ -3471,7 +3379,7 @@
       </w:pPr>
       <w:r>
         <w:rPr>
-          <w:rFonts w:ascii="Century Gothic" w:hAnsi="Century Gothic"/>
+          <w:rFonts w:ascii="Calibri" w:hAnsi="Calibri" w:cs="Calibri"/>
           <w:b w:val="0"/>
           <w:bCs w:val="0"/>
           <w:sz w:val="20"/>
@@ -3488,7 +3396,7 @@
           <w:numId w:val="2"/>
         </w:numPr>
         <w:rPr>
-          <w:rFonts w:ascii="Century Gothic" w:hAnsi="Century Gothic"/>
+          <w:rFonts w:ascii="Calibri" w:hAnsi="Calibri" w:cs="Calibri"/>
           <w:b w:val="0"/>
           <w:bCs w:val="0"/>
           <w:sz w:val="20"/>
@@ -3497,7 +3405,7 @@
       </w:pPr>
       <w:r>
         <w:rPr>
-          <w:rFonts w:ascii="Century Gothic" w:hAnsi="Century Gothic"/>
+          <w:rFonts w:ascii="Calibri" w:hAnsi="Calibri" w:cs="Calibri"/>
           <w:b w:val="0"/>
           <w:bCs w:val="0"/>
           <w:sz w:val="20"/>
@@ -3514,12 +3422,12 @@
           <w:numId w:val="2"/>
         </w:numPr>
         <w:rPr>
-          <w:rFonts w:ascii="Century Gothic" w:hAnsi="Century Gothic"/>
-        </w:rPr>
-      </w:pPr>
-      <w:r>
-        <w:rPr>
-          <w:rFonts w:ascii="Century Gothic" w:hAnsi="Century Gothic"/>
+          <w:rFonts w:ascii="Calibri" w:hAnsi="Calibri" w:cs="Calibri"/>
+        </w:rPr>
+      </w:pPr>
+      <w:r>
+        <w:rPr>
+          <w:rFonts w:ascii="Calibri" w:hAnsi="Calibri" w:cs="Calibri"/>
           <w:b w:val="0"/>
           <w:bCs w:val="0"/>
           <w:sz w:val="20"/>
@@ -3529,7 +3437,7 @@
       </w:r>
       <w:r>
         <w:rPr>
-          <w:rFonts w:ascii="Century Gothic" w:hAnsi="Century Gothic"/>
+          <w:rFonts w:ascii="Calibri" w:hAnsi="Calibri" w:cs="Calibri"/>
           <w:b w:val="0"/>
           <w:bCs w:val="0"/>
           <w:sz w:val="20"/>
@@ -3537,12 +3445,13 @@
         </w:rPr>
         <w:br/>
       </w:r>
+      <w:bookmarkEnd w:id="1"/>
     </w:p>
     <w:p>
       <w:pPr>
         <w:pStyle w:val="Heading1"/>
         <w:rPr>
-          <w:rFonts w:ascii="Century Gothic" w:hAnsi="Century Gothic"/>
+          <w:rFonts w:ascii="Calibri" w:hAnsi="Calibri" w:cs="Calibri"/>
           <w:b w:val="0"/>
           <w:bCs w:val="0"/>
           <w:sz w:val="20"/>
@@ -3554,7 +3463,7 @@
       <w:pPr>
         <w:pStyle w:val="Heading1"/>
         <w:rPr>
-          <w:rFonts w:ascii="Century Gothic" w:hAnsi="Century Gothic"/>
+          <w:rFonts w:ascii="Calibri" w:hAnsi="Calibri" w:cs="Calibri"/>
         </w:rPr>
       </w:pPr>
     </w:p>
@@ -3562,7 +3471,7 @@
       <w:pPr>
         <w:pStyle w:val="Heading1"/>
         <w:rPr>
-          <w:rFonts w:ascii="Century Gothic" w:hAnsi="Century Gothic"/>
+          <w:rFonts w:ascii="Calibri" w:hAnsi="Calibri" w:cs="Calibri"/>
         </w:rPr>
       </w:pPr>
     </w:p>
@@ -3570,7 +3479,7 @@
       <w:pPr>
         <w:pStyle w:val="Heading1"/>
         <w:rPr>
-          <w:rFonts w:ascii="Century Gothic" w:hAnsi="Century Gothic"/>
+          <w:rFonts w:ascii="Calibri" w:hAnsi="Calibri" w:cs="Calibri"/>
         </w:rPr>
       </w:pPr>
     </w:p>
@@ -3579,7 +3488,7 @@
         <w:pStyle w:val="Heading1"/>
         <w:ind w:left="720"/>
         <w:rPr>
-          <w:rFonts w:ascii="Century Gothic" w:hAnsi="Century Gothic"/>
+          <w:rFonts w:ascii="Calibri" w:hAnsi="Calibri" w:cs="Calibri"/>
         </w:rPr>
         <w:sectPr>
           <w:type w:val="continuous"/>
@@ -3596,28 +3505,28 @@
       <w:pPr>
         <w:pStyle w:val="BodyText"/>
         <w:rPr>
-          <w:rFonts w:ascii="Century Gothic" w:hAnsi="Century Gothic"/>
-          <w:sz w:val="20"/>
-        </w:rPr>
-      </w:pPr>
-      <w:r>
-        <w:rPr>
-          <w:rFonts w:ascii="Century Gothic" w:hAnsi="Century Gothic"/>
+          <w:rFonts w:ascii="Calibri" w:hAnsi="Calibri" w:cs="Calibri"/>
+          <w:sz w:val="20"/>
+        </w:rPr>
+      </w:pPr>
+      <w:r>
+        <w:rPr>
+          <w:rFonts w:ascii="Calibri" w:hAnsi="Calibri" w:cs="Calibri"/>
           <w:noProof/>
         </w:rPr>
         <w:lastRenderedPageBreak/>
         <mc:AlternateContent>
           <mc:Choice Requires="wps">
             <w:drawing>
-              <wp:anchor distT="0" distB="0" distL="0" distR="0" simplePos="0" relativeHeight="251719168" behindDoc="1" locked="0" layoutInCell="1" allowOverlap="1" wp14:anchorId="39CD8B00" wp14:editId="4A4D7452">
+              <wp:anchor distT="0" distB="0" distL="0" distR="0" simplePos="0" relativeHeight="251661824" behindDoc="1" locked="0" layoutInCell="1" allowOverlap="1" wp14:anchorId="39CD8B00" wp14:editId="79D2741A">
                 <wp:simplePos x="0" y="0"/>
                 <wp:positionH relativeFrom="page">
                   <wp:posOffset>0</wp:posOffset>
                 </wp:positionH>
                 <wp:positionV relativeFrom="page">
-                  <wp:posOffset>-57150</wp:posOffset>
+                  <wp:posOffset>12700</wp:posOffset>
                 </wp:positionV>
-                <wp:extent cx="3028950" cy="10692765"/>
+                <wp:extent cx="3028950" cy="10674350"/>
                 <wp:effectExtent l="0" t="0" r="0" b="0"/>
                 <wp:wrapNone/>
                 <wp:docPr id="681449384" name="Graphic 1"/>
@@ -3633,7 +3542,7 @@
                       <wps:spPr>
                         <a:xfrm>
                           <a:off x="0" y="0"/>
-                          <a:ext cx="3028950" cy="10692765"/>
+                          <a:ext cx="3028950" cy="10674350"/>
                         </a:xfrm>
                         <a:custGeom>
                           <a:avLst/>
@@ -3680,12 +3589,15 @@
                 <wp14:sizeRelH relativeFrom="margin">
                   <wp14:pctWidth>0</wp14:pctWidth>
                 </wp14:sizeRelH>
+                <wp14:sizeRelV relativeFrom="margin">
+                  <wp14:pctHeight>0</wp14:pctHeight>
+                </wp14:sizeRelV>
               </wp:anchor>
             </w:drawing>
           </mc:Choice>
           <mc:Fallback>
             <w:pict>
-              <v:shape w14:anchorId="23584994" id="Graphic 1" o:spid="_x0000_s1026" style="position:absolute;margin-left:0;margin-top:-4.5pt;width:238.5pt;height:841.95pt;z-index:-251597312;visibility:visible;mso-wrap-style:square;mso-width-percent:0;mso-wrap-distance-left:0;mso-wrap-distance-top:0;mso-wrap-distance-right:0;mso-wrap-distance-bottom:0;mso-position-horizontal:absolute;mso-position-horizontal-relative:page;mso-position-vertical:absolute;mso-position-vertical-relative:page;mso-width-percent:0;mso-width-relative:margin;v-text-anchor:top" coordsize="3019425,10692765" o:gfxdata="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" path="m,10692383l,,3019424,r,10692383l,10692383xe" fillcolor="#7f7f7f [1612]" stroked="f">
+              <v:shape w14:anchorId="2B7A3A1D" id="Graphic 1" o:spid="_x0000_s1026" style="position:absolute;margin-left:0;margin-top:1pt;width:238.5pt;height:840.5pt;z-index:-251654656;visibility:visible;mso-wrap-style:square;mso-width-percent:0;mso-height-percent:0;mso-wrap-distance-left:0;mso-wrap-distance-top:0;mso-wrap-distance-right:0;mso-wrap-distance-bottom:0;mso-position-horizontal:absolute;mso-position-horizontal-relative:page;mso-position-vertical:absolute;mso-position-vertical-relative:page;mso-width-percent:0;mso-height-percent:0;mso-width-relative:margin;mso-height-relative:margin;v-text-anchor:top" coordsize="3019425,10692765" o:gfxdata="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" path="m,10692383l,,3019424,r,10692383l,10692383xe" fillcolor="#7f7f7f [1612]" stroked="f">
                 <v:path arrowok="t"/>
                 <w10:wrap anchorx="page" anchory="page"/>
               </v:shape>
@@ -3698,7 +3610,7 @@
       <w:pPr>
         <w:pStyle w:val="BodyText"/>
         <w:rPr>
-          <w:rFonts w:ascii="Century Gothic" w:hAnsi="Century Gothic"/>
+          <w:rFonts w:ascii="Calibri" w:hAnsi="Calibri" w:cs="Calibri"/>
           <w:sz w:val="20"/>
         </w:rPr>
       </w:pPr>
@@ -3707,7 +3619,7 @@
       <w:pPr>
         <w:pStyle w:val="BodyText"/>
         <w:rPr>
-          <w:rFonts w:ascii="Century Gothic" w:hAnsi="Century Gothic"/>
+          <w:rFonts w:ascii="Calibri" w:hAnsi="Calibri" w:cs="Calibri"/>
           <w:sz w:val="20"/>
         </w:rPr>
       </w:pPr>
@@ -3716,7 +3628,7 @@
       <w:pPr>
         <w:pStyle w:val="BodyText"/>
         <w:rPr>
-          <w:rFonts w:ascii="Century Gothic" w:hAnsi="Century Gothic"/>
+          <w:rFonts w:ascii="Calibri" w:hAnsi="Calibri" w:cs="Calibri"/>
           <w:sz w:val="20"/>
         </w:rPr>
       </w:pPr>
@@ -3725,7 +3637,7 @@
       <w:pPr>
         <w:pStyle w:val="BodyText"/>
         <w:rPr>
-          <w:rFonts w:ascii="Century Gothic" w:hAnsi="Century Gothic"/>
+          <w:rFonts w:ascii="Calibri" w:hAnsi="Calibri" w:cs="Calibri"/>
           <w:sz w:val="20"/>
         </w:rPr>
         <w:sectPr>
@@ -3741,7 +3653,7 @@
         <w:spacing w:line="30" w:lineRule="exact"/>
         <w:ind w:left="28" w:right="-72"/>
         <w:rPr>
-          <w:rFonts w:ascii="Century Gothic" w:hAnsi="Century Gothic"/>
+          <w:rFonts w:ascii="Calibri" w:hAnsi="Calibri" w:cs="Calibri"/>
           <w:sz w:val="2"/>
         </w:rPr>
       </w:pPr>
@@ -3751,42 +3663,7 @@
         <w:spacing w:before="252" w:line="271" w:lineRule="auto"/>
         <w:ind w:left="28" w:right="340"/>
         <w:rPr>
-          <w:rFonts w:ascii="Century Gothic" w:hAnsi="Century Gothic"/>
-          <w:b/>
-          <w:color w:val="F6F7F1"/>
-        </w:rPr>
-      </w:pPr>
-      <w:r>
-        <w:rPr>
-          <w:rFonts w:ascii="Century Gothic" w:hAnsi="Century Gothic"/>
-          <w:b/>
-          <w:color w:val="F6F7F1"/>
-        </w:rPr>
-        <w:t>SDE</w:t>
-      </w:r>
-      <w:r>
-        <w:rPr>
-          <w:rFonts w:ascii="Century Gothic" w:hAnsi="Century Gothic"/>
-          <w:b/>
-          <w:color w:val="F6F7F1"/>
-        </w:rPr>
-        <w:t xml:space="preserve"> </w:t>
-      </w:r>
-      <w:r>
-        <w:rPr>
-          <w:rFonts w:ascii="Century Gothic" w:hAnsi="Century Gothic"/>
-          <w:b/>
-          <w:color w:val="F6F7F1"/>
-        </w:rPr>
-        <w:t>II</w:t>
-      </w:r>
-    </w:p>
-    <w:p>
-      <w:pPr>
-        <w:spacing w:line="271" w:lineRule="auto"/>
-        <w:ind w:left="29" w:right="346"/>
-        <w:rPr>
-          <w:rFonts w:ascii="Century Gothic" w:hAnsi="Century Gothic"/>
+          <w:rFonts w:ascii="Calibri" w:hAnsi="Calibri" w:cs="Calibri"/>
           <w:i/>
           <w:iCs/>
           <w:color w:val="FFFFFF" w:themeColor="background1"/>
@@ -3796,39 +3673,75 @@
       </w:pPr>
       <w:r>
         <w:rPr>
-          <w:rFonts w:ascii="Century Gothic" w:hAnsi="Century Gothic"/>
+          <w:rFonts w:ascii="Calibri" w:hAnsi="Calibri" w:cs="Calibri"/>
           <w:b/>
           <w:color w:val="F6F7F1"/>
         </w:rPr>
+        <w:t>SDE</w:t>
+      </w:r>
+      <w:r>
+        <w:rPr>
+          <w:rFonts w:ascii="Calibri" w:hAnsi="Calibri" w:cs="Calibri"/>
+          <w:b/>
+          <w:color w:val="F6F7F1"/>
+        </w:rPr>
+        <w:t xml:space="preserve"> </w:t>
+      </w:r>
+      <w:r>
+        <w:rPr>
+          <w:rFonts w:ascii="Calibri" w:hAnsi="Calibri" w:cs="Calibri"/>
+          <w:b/>
+          <w:color w:val="F6F7F1"/>
+        </w:rPr>
+        <w:t>II</w:t>
+      </w:r>
+      <w:r>
+        <w:rPr>
+          <w:rFonts w:ascii="Calibri" w:hAnsi="Calibri" w:cs="Calibri"/>
+          <w:b/>
+          <w:color w:val="F6F7F1"/>
+        </w:rPr>
+        <w:t xml:space="preserve">, </w:t>
+      </w:r>
+      <w:r>
+        <w:rPr>
+          <w:rFonts w:ascii="Calibri" w:hAnsi="Calibri" w:cs="Calibri"/>
+          <w:bCs/>
+          <w:i/>
+          <w:iCs/>
+          <w:color w:val="F6F7F1"/>
+        </w:rPr>
         <w:t xml:space="preserve">Softobiz </w:t>
       </w:r>
       <w:r>
         <w:rPr>
-          <w:rFonts w:ascii="Century Gothic" w:hAnsi="Century Gothic"/>
+          <w:rFonts w:ascii="Calibri" w:hAnsi="Calibri" w:cs="Calibri"/>
+          <w:bCs/>
+          <w:i/>
+          <w:iCs/>
+          <w:color w:val="F6F7F1"/>
+        </w:rPr>
+        <w:t>Technologies</w:t>
+      </w:r>
+      <w:r>
+        <w:rPr>
+          <w:rFonts w:ascii="Calibri" w:hAnsi="Calibri" w:cs="Calibri"/>
           <w:b/>
           <w:color w:val="F6F7F1"/>
         </w:rPr>
-        <w:t>Technologies</w:t>
-      </w:r>
-      <w:r>
-        <w:rPr>
-          <w:rFonts w:ascii="Century Gothic" w:hAnsi="Century Gothic"/>
+        <w:t xml:space="preserve"> </w:t>
+      </w:r>
+      <w:r>
+        <w:rPr>
+          <w:rFonts w:ascii="Calibri" w:hAnsi="Calibri" w:cs="Calibri"/>
           <w:b/>
           <w:color w:val="F6F7F1"/>
         </w:rPr>
-        <w:t xml:space="preserve"> </w:t>
-      </w:r>
-      <w:r>
-        <w:rPr>
-          <w:rFonts w:ascii="Century Gothic" w:hAnsi="Century Gothic"/>
-          <w:b/>
-          <w:color w:val="F6F7F1"/>
-        </w:rPr>
         <w:br/>
       </w:r>
       <w:r>
         <w:rPr>
-          <w:rFonts w:ascii="Century Gothic" w:hAnsi="Century Gothic"/>
+          <w:rFonts w:ascii="Calibri" w:hAnsi="Calibri" w:cs="Calibri"/>
           <w:i/>
           <w:iCs/>
           <w:color w:val="FFFFFF" w:themeColor="background1"/>
@@ -3843,14 +3756,14 @@
         <w:spacing w:line="271" w:lineRule="auto"/>
         <w:ind w:left="29" w:right="346"/>
         <w:rPr>
-          <w:rFonts w:ascii="Century Gothic" w:hAnsi="Century Gothic"/>
-          <w:sz w:val="20"/>
-          <w:szCs w:val="20"/>
-        </w:rPr>
-      </w:pPr>
-      <w:r>
-        <w:rPr>
-          <w:rFonts w:ascii="Century Gothic" w:hAnsi="Century Gothic"/>
+          <w:rFonts w:ascii="Calibri" w:hAnsi="Calibri" w:cs="Calibri"/>
+          <w:sz w:val="20"/>
+          <w:szCs w:val="20"/>
+        </w:rPr>
+      </w:pPr>
+      <w:r>
+        <w:rPr>
+          <w:rFonts w:ascii="Calibri" w:hAnsi="Calibri" w:cs="Calibri"/>
           <w:color w:val="FFFFFF" w:themeColor="background1"/>
           <w:sz w:val="20"/>
           <w:szCs w:val="20"/>
@@ -3859,7 +3772,7 @@
       </w:r>
       <w:r>
         <w:rPr>
-          <w:rFonts w:ascii="Century Gothic" w:hAnsi="Century Gothic"/>
+          <w:rFonts w:ascii="Calibri" w:hAnsi="Calibri" w:cs="Calibri"/>
           <w:color w:val="FFFFFF" w:themeColor="background1"/>
           <w:sz w:val="20"/>
           <w:szCs w:val="20"/>
@@ -3868,7 +3781,7 @@
       </w:r>
       <w:r>
         <w:rPr>
-          <w:rFonts w:ascii="Century Gothic" w:hAnsi="Century Gothic"/>
+          <w:rFonts w:ascii="Calibri" w:hAnsi="Calibri" w:cs="Calibri"/>
           <w:color w:val="FFFFFF" w:themeColor="background1"/>
           <w:sz w:val="20"/>
           <w:szCs w:val="20"/>
@@ -3877,7 +3790,7 @@
       </w:r>
       <w:r>
         <w:rPr>
-          <w:rFonts w:ascii="Century Gothic" w:hAnsi="Century Gothic"/>
+          <w:rFonts w:ascii="Calibri" w:hAnsi="Calibri" w:cs="Calibri"/>
           <w:color w:val="FFFFFF" w:themeColor="background1"/>
           <w:sz w:val="20"/>
           <w:szCs w:val="20"/>
@@ -3886,7 +3799,7 @@
       </w:r>
       <w:r>
         <w:rPr>
-          <w:rFonts w:ascii="Century Gothic" w:hAnsi="Century Gothic"/>
+          <w:rFonts w:ascii="Calibri" w:hAnsi="Calibri" w:cs="Calibri"/>
           <w:color w:val="FFFFFF" w:themeColor="background1"/>
           <w:sz w:val="20"/>
           <w:szCs w:val="20"/>
@@ -3895,7 +3808,7 @@
       </w:r>
       <w:r>
         <w:rPr>
-          <w:rFonts w:ascii="Century Gothic" w:hAnsi="Century Gothic"/>
+          <w:rFonts w:ascii="Calibri" w:hAnsi="Calibri" w:cs="Calibri"/>
           <w:color w:val="FFFFFF" w:themeColor="background1"/>
           <w:sz w:val="20"/>
           <w:szCs w:val="20"/>
@@ -3904,27 +3817,25 @@
       </w:r>
       <w:r>
         <w:rPr>
-          <w:rFonts w:ascii="Century Gothic" w:hAnsi="Century Gothic"/>
+          <w:rFonts w:ascii="Calibri" w:hAnsi="Calibri" w:cs="Calibri"/>
           <w:color w:val="FFFFFF" w:themeColor="background1"/>
           <w:sz w:val="20"/>
           <w:szCs w:val="20"/>
         </w:rPr>
         <w:t xml:space="preserve"> the Client. </w:t>
       </w:r>
-      <w:proofErr w:type="gramStart"/>
-      <w:r>
-        <w:rPr>
-          <w:rFonts w:ascii="Century Gothic" w:hAnsi="Century Gothic"/>
+      <w:r>
+        <w:rPr>
+          <w:rFonts w:ascii="Calibri" w:hAnsi="Calibri" w:cs="Calibri"/>
           <w:color w:val="FFFFFF" w:themeColor="background1"/>
           <w:sz w:val="20"/>
           <w:szCs w:val="20"/>
         </w:rPr>
-        <w:t>Worked</w:t>
-      </w:r>
-      <w:proofErr w:type="gramEnd"/>
-      <w:r>
-        <w:rPr>
-          <w:rFonts w:ascii="Century Gothic" w:hAnsi="Century Gothic"/>
+        <w:t>I worked</w:t>
+      </w:r>
+      <w:r>
+        <w:rPr>
+          <w:rFonts w:ascii="Calibri" w:hAnsi="Calibri" w:cs="Calibri"/>
           <w:color w:val="FFFFFF" w:themeColor="background1"/>
           <w:sz w:val="20"/>
           <w:szCs w:val="20"/>
@@ -3933,7 +3844,7 @@
       </w:r>
       <w:r>
         <w:rPr>
-          <w:rFonts w:ascii="Century Gothic" w:hAnsi="Century Gothic"/>
+          <w:rFonts w:ascii="Calibri" w:hAnsi="Calibri" w:cs="Calibri"/>
           <w:color w:val="FFFFFF" w:themeColor="background1"/>
           <w:sz w:val="20"/>
           <w:szCs w:val="20"/>
@@ -3942,7 +3853,7 @@
       </w:r>
       <w:r>
         <w:rPr>
-          <w:rFonts w:ascii="Century Gothic" w:hAnsi="Century Gothic"/>
+          <w:rFonts w:ascii="Calibri" w:hAnsi="Calibri" w:cs="Calibri"/>
           <w:color w:val="FFFFFF" w:themeColor="background1"/>
           <w:sz w:val="20"/>
           <w:szCs w:val="20"/>
@@ -3951,7 +3862,7 @@
       </w:r>
       <w:r>
         <w:rPr>
-          <w:rFonts w:ascii="Century Gothic" w:hAnsi="Century Gothic"/>
+          <w:rFonts w:ascii="Calibri" w:hAnsi="Calibri" w:cs="Calibri"/>
           <w:color w:val="FFFFFF" w:themeColor="background1"/>
           <w:sz w:val="20"/>
           <w:szCs w:val="20"/>
@@ -3960,7 +3871,7 @@
       </w:r>
       <w:r>
         <w:rPr>
-          <w:rFonts w:ascii="Century Gothic" w:hAnsi="Century Gothic"/>
+          <w:rFonts w:ascii="Calibri" w:hAnsi="Calibri" w:cs="Calibri"/>
           <w:color w:val="FFFFFF" w:themeColor="background1"/>
           <w:sz w:val="20"/>
           <w:szCs w:val="20"/>
@@ -3974,7 +3885,7 @@
         <w:spacing w:before="12" w:line="256" w:lineRule="auto"/>
         <w:ind w:left="28"/>
         <w:rPr>
-          <w:rFonts w:ascii="Century Gothic" w:hAnsi="Century Gothic"/>
+          <w:rFonts w:ascii="Calibri" w:hAnsi="Calibri" w:cs="Calibri"/>
           <w:sz w:val="20"/>
           <w:szCs w:val="20"/>
         </w:rPr>
@@ -3985,22 +3896,22 @@
         <w:pStyle w:val="Heading1"/>
         <w:ind w:left="0"/>
         <w:rPr>
-          <w:rFonts w:ascii="Century Gothic" w:hAnsi="Century Gothic"/>
-        </w:rPr>
-      </w:pPr>
-      <w:r>
-        <w:rPr>
-          <w:rFonts w:ascii="Century Gothic" w:hAnsi="Century Gothic"/>
+          <w:rFonts w:ascii="Calibri" w:hAnsi="Calibri" w:cs="Calibri"/>
+        </w:rPr>
+      </w:pPr>
+      <w:r>
+        <w:rPr>
+          <w:rFonts w:ascii="Calibri" w:hAnsi="Calibri" w:cs="Calibri"/>
           <w:b w:val="0"/>
           <w:sz w:val="22"/>
           <w:szCs w:val="22"/>
         </w:rPr>
         <w:br w:type="column"/>
       </w:r>
-      <w:r>
-        <w:rPr>
-          <w:rFonts w:ascii="Century Gothic" w:hAnsi="Century Gothic"/>
-          <w:color w:val="374B40"/>
+      <w:bookmarkStart w:id="2" w:name="_Hlk192951623"/>
+      <w:r>
+        <w:rPr>
+          <w:rFonts w:ascii="Calibri" w:hAnsi="Calibri" w:cs="Calibri"/>
           <w:spacing w:val="-2"/>
         </w:rPr>
         <w:t>Corresponding Address</w:t>
@@ -4012,19 +3923,19 @@
         <w:spacing w:before="267" w:line="312" w:lineRule="auto"/>
         <w:ind w:left="28"/>
         <w:rPr>
-          <w:rFonts w:ascii="Century Gothic" w:hAnsi="Century Gothic"/>
+          <w:rFonts w:ascii="Calibri" w:hAnsi="Calibri" w:cs="Calibri"/>
           <w:b/>
         </w:rPr>
       </w:pPr>
       <w:r>
         <w:rPr>
-          <w:rFonts w:ascii="Century Gothic" w:hAnsi="Century Gothic"/>
+          <w:rFonts w:ascii="Calibri" w:hAnsi="Calibri" w:cs="Calibri"/>
           <w:noProof/>
         </w:rPr>
         <mc:AlternateContent>
           <mc:Choice Requires="wps">
             <w:drawing>
-              <wp:anchor distT="0" distB="0" distL="0" distR="0" simplePos="0" relativeHeight="251725312" behindDoc="0" locked="0" layoutInCell="1" allowOverlap="1" wp14:anchorId="1261BD12" wp14:editId="13CB9B20">
+              <wp:anchor distT="0" distB="0" distL="0" distR="0" simplePos="0" relativeHeight="251666944" behindDoc="0" locked="0" layoutInCell="1" allowOverlap="1" wp14:anchorId="1261BD12" wp14:editId="13CB9B20">
                 <wp:simplePos x="0" y="0"/>
                 <wp:positionH relativeFrom="page">
                   <wp:posOffset>3512820</wp:posOffset>
@@ -4095,7 +4006,7 @@
           </mc:Choice>
           <mc:Fallback>
             <w:pict>
-              <v:shape w14:anchorId="5796F5B3" id="Graphic 45" o:spid="_x0000_s1026" style="position:absolute;margin-left:276.6pt;margin-top:4.25pt;width:265.5pt;height:1.5pt;z-index:251725312;visibility:visible;mso-wrap-style:square;mso-wrap-distance-left:0;mso-wrap-distance-top:0;mso-wrap-distance-right:0;mso-wrap-distance-bottom:0;mso-position-horizontal:absolute;mso-position-horizontal-relative:page;mso-position-vertical:absolute;mso-position-vertical-relative:text;v-text-anchor:top" coordsize="3371850,19050" o:gfxdata="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" path="m3371849,19049l,19049,,,3371849,r,19049xe" fillcolor="#374b40" stroked="f">
+              <v:shape w14:anchorId="538D2F13" id="Graphic 45" o:spid="_x0000_s1026" style="position:absolute;margin-left:276.6pt;margin-top:4.25pt;width:265.5pt;height:1.5pt;z-index:251666944;visibility:visible;mso-wrap-style:square;mso-wrap-distance-left:0;mso-wrap-distance-top:0;mso-wrap-distance-right:0;mso-wrap-distance-bottom:0;mso-position-horizontal:absolute;mso-position-horizontal-relative:page;mso-position-vertical:absolute;mso-position-vertical-relative:text;v-text-anchor:top" coordsize="3371850,19050" o:gfxdata="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" path="m3371849,19049l,19049,,,3371849,r,19049xe" fillcolor="#374b40" stroked="f">
                 <v:path arrowok="t"/>
                 <w10:wrap anchorx="page"/>
               </v:shape>
@@ -4105,8 +4016,7 @@
       </w:r>
       <w:r>
         <w:rPr>
-          <w:rFonts w:ascii="Century Gothic" w:hAnsi="Century Gothic"/>
-          <w:color w:val="374B40"/>
+          <w:rFonts w:ascii="Calibri" w:hAnsi="Calibri" w:cs="Calibri"/>
           <w:spacing w:val="-4"/>
           <w:sz w:val="20"/>
           <w:szCs w:val="20"/>
@@ -4116,8 +4026,7 @@
       <w:proofErr w:type="spellStart"/>
       <w:r>
         <w:rPr>
-          <w:rFonts w:ascii="Century Gothic" w:hAnsi="Century Gothic"/>
-          <w:color w:val="374B40"/>
+          <w:rFonts w:ascii="Calibri" w:hAnsi="Calibri" w:cs="Calibri"/>
           <w:spacing w:val="-4"/>
           <w:sz w:val="20"/>
           <w:szCs w:val="20"/>
@@ -4127,8 +4036,7 @@
       <w:proofErr w:type="spellEnd"/>
       <w:r>
         <w:rPr>
-          <w:rFonts w:ascii="Century Gothic" w:hAnsi="Century Gothic"/>
-          <w:color w:val="374B40"/>
+          <w:rFonts w:ascii="Calibri" w:hAnsi="Calibri" w:cs="Calibri"/>
           <w:spacing w:val="-4"/>
           <w:sz w:val="20"/>
           <w:szCs w:val="20"/>
@@ -4136,22 +4044,23 @@
         <w:t>, S.A.S. Nagar Mohali -160103</w:t>
       </w:r>
     </w:p>
+    <w:bookmarkEnd w:id="2"/>
     <w:p>
       <w:pPr>
         <w:pStyle w:val="Heading1"/>
         <w:spacing w:before="189"/>
         <w:ind w:left="0"/>
         <w:rPr>
-          <w:rFonts w:ascii="Century Gothic" w:hAnsi="Century Gothic"/>
-        </w:rPr>
-      </w:pPr>
-      <w:r>
-        <w:rPr>
-          <w:rFonts w:ascii="Century Gothic" w:hAnsi="Century Gothic"/>
+          <w:rFonts w:ascii="Calibri" w:hAnsi="Calibri" w:cs="Calibri"/>
+        </w:rPr>
+      </w:pPr>
+      <w:r>
+        <w:rPr>
+          <w:rFonts w:ascii="Calibri" w:hAnsi="Calibri" w:cs="Calibri"/>
           <w:noProof/>
         </w:rPr>
         <w:drawing>
-          <wp:anchor distT="0" distB="0" distL="0" distR="0" simplePos="0" relativeHeight="251716096" behindDoc="0" locked="0" layoutInCell="1" allowOverlap="1" wp14:anchorId="423D2F5A" wp14:editId="0F6C6AB7">
+          <wp:anchor distT="0" distB="0" distL="0" distR="0" simplePos="0" relativeHeight="251660800" behindDoc="0" locked="0" layoutInCell="1" allowOverlap="1" wp14:anchorId="423D2F5A" wp14:editId="0F6C6AB7">
             <wp:simplePos x="0" y="0"/>
             <wp:positionH relativeFrom="page">
               <wp:posOffset>6838950</wp:posOffset>
@@ -4199,14 +4108,14 @@
       <w:pPr>
         <w:pStyle w:val="Heading1"/>
         <w:rPr>
-          <w:rFonts w:ascii="Century Gothic" w:hAnsi="Century Gothic"/>
+          <w:rFonts w:ascii="Calibri" w:hAnsi="Calibri" w:cs="Calibri"/>
           <w:sz w:val="22"/>
           <w:szCs w:val="22"/>
         </w:rPr>
       </w:pPr>
       <w:r>
         <w:rPr>
-          <w:rFonts w:ascii="Century Gothic" w:hAnsi="Century Gothic"/>
+          <w:rFonts w:ascii="Calibri" w:hAnsi="Calibri" w:cs="Calibri"/>
           <w:noProof/>
           <w:sz w:val="22"/>
           <w:szCs w:val="22"/>
@@ -4214,7 +4123,7 @@
         <mc:AlternateContent>
           <mc:Choice Requires="wps">
             <w:drawing>
-              <wp:anchor distT="0" distB="0" distL="0" distR="0" simplePos="0" relativeHeight="251720192" behindDoc="0" locked="0" layoutInCell="1" allowOverlap="1" wp14:anchorId="2FDF92E7" wp14:editId="2F138295">
+              <wp:anchor distT="0" distB="0" distL="0" distR="0" simplePos="0" relativeHeight="251664896" behindDoc="0" locked="0" layoutInCell="1" allowOverlap="1" wp14:anchorId="2FDF92E7" wp14:editId="2F138295">
                 <wp:simplePos x="0" y="0"/>
                 <wp:positionH relativeFrom="page">
                   <wp:posOffset>3543299</wp:posOffset>
@@ -4285,7 +4194,7 @@
           </mc:Choice>
           <mc:Fallback>
             <w:pict>
-              <v:shape w14:anchorId="37D2FC8C" id="Graphic 45" o:spid="_x0000_s1026" style="position:absolute;margin-left:279pt;margin-top:15.7pt;width:265.5pt;height:1.5pt;z-index:251720192;visibility:visible;mso-wrap-style:square;mso-wrap-distance-left:0;mso-wrap-distance-top:0;mso-wrap-distance-right:0;mso-wrap-distance-bottom:0;mso-position-horizontal:absolute;mso-position-horizontal-relative:page;mso-position-vertical:absolute;mso-position-vertical-relative:text;v-text-anchor:top" coordsize="3371850,19050" o:gfxdata="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" path="m3371849,19049l,19049,,,3371849,r,19049xe" fillcolor="#374b40" stroked="f">
+              <v:shape w14:anchorId="2AB088FE" id="Graphic 45" o:spid="_x0000_s1026" style="position:absolute;margin-left:279pt;margin-top:15.7pt;width:265.5pt;height:1.5pt;z-index:251664896;visibility:visible;mso-wrap-style:square;mso-wrap-distance-left:0;mso-wrap-distance-top:0;mso-wrap-distance-right:0;mso-wrap-distance-bottom:0;mso-position-horizontal:absolute;mso-position-horizontal-relative:page;mso-position-vertical:absolute;mso-position-vertical-relative:text;v-text-anchor:top" coordsize="3371850,19050" o:gfxdata="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" path="m3371849,19049l,19049,,,3371849,r,19049xe" fillcolor="#374b40" stroked="f">
                 <v:path arrowok="t"/>
                 <w10:wrap anchorx="page"/>
               </v:shape>
@@ -4295,8 +4204,7 @@
       </w:r>
       <w:r>
         <w:rPr>
-          <w:rFonts w:ascii="Century Gothic" w:hAnsi="Century Gothic"/>
-          <w:color w:val="374B40"/>
+          <w:rFonts w:ascii="Calibri" w:hAnsi="Calibri" w:cs="Calibri"/>
           <w:spacing w:val="-2"/>
           <w:sz w:val="22"/>
           <w:szCs w:val="22"/>
@@ -4308,7 +4216,7 @@
       <w:pPr>
         <w:pStyle w:val="Heading1"/>
         <w:rPr>
-          <w:rFonts w:ascii="Century Gothic" w:hAnsi="Century Gothic"/>
+          <w:rFonts w:ascii="Calibri" w:hAnsi="Calibri" w:cs="Calibri"/>
         </w:rPr>
       </w:pPr>
     </w:p>
@@ -4316,7 +4224,7 @@
       <w:pPr>
         <w:pStyle w:val="Heading1"/>
         <w:rPr>
-          <w:rFonts w:ascii="Century Gothic" w:hAnsi="Century Gothic"/>
+          <w:rFonts w:ascii="Calibri" w:hAnsi="Calibri" w:cs="Calibri"/>
           <w:b w:val="0"/>
           <w:bCs w:val="0"/>
           <w:sz w:val="20"/>
@@ -4325,7 +4233,7 @@
       </w:pPr>
       <w:r>
         <w:rPr>
-          <w:rFonts w:ascii="Century Gothic" w:hAnsi="Century Gothic"/>
+          <w:rFonts w:ascii="Calibri" w:hAnsi="Calibri" w:cs="Calibri"/>
           <w:b w:val="0"/>
           <w:bCs w:val="0"/>
           <w:sz w:val="20"/>
@@ -4338,7 +4246,7 @@
       <w:pPr>
         <w:pStyle w:val="Heading1"/>
         <w:rPr>
-          <w:rFonts w:ascii="Century Gothic" w:hAnsi="Century Gothic"/>
+          <w:rFonts w:ascii="Calibri" w:hAnsi="Calibri" w:cs="Calibri"/>
           <w:b w:val="0"/>
           <w:bCs w:val="0"/>
           <w:sz w:val="20"/>
@@ -4350,7 +4258,7 @@
       <w:pPr>
         <w:pStyle w:val="Heading1"/>
         <w:rPr>
-          <w:rFonts w:ascii="Century Gothic" w:hAnsi="Century Gothic"/>
+          <w:rFonts w:ascii="Calibri" w:hAnsi="Calibri" w:cs="Calibri"/>
           <w:b w:val="0"/>
           <w:bCs w:val="0"/>
           <w:sz w:val="20"/>
@@ -4360,7 +4268,7 @@
       <w:proofErr w:type="gramStart"/>
       <w:r>
         <w:rPr>
-          <w:rFonts w:ascii="Century Gothic" w:hAnsi="Century Gothic"/>
+          <w:rFonts w:ascii="Calibri" w:hAnsi="Calibri" w:cs="Calibri"/>
           <w:b w:val="0"/>
           <w:bCs w:val="0"/>
           <w:sz w:val="20"/>
@@ -4374,7 +4282,7 @@
       <w:pPr>
         <w:pStyle w:val="Heading1"/>
         <w:rPr>
-          <w:rFonts w:ascii="Century Gothic" w:hAnsi="Century Gothic"/>
+          <w:rFonts w:ascii="Calibri" w:hAnsi="Calibri" w:cs="Calibri"/>
           <w:b w:val="0"/>
           <w:bCs w:val="0"/>
           <w:sz w:val="20"/>
@@ -4386,7 +4294,7 @@
       <w:pPr>
         <w:pStyle w:val="Heading1"/>
         <w:rPr>
-          <w:rFonts w:ascii="Century Gothic" w:hAnsi="Century Gothic"/>
+          <w:rFonts w:ascii="Calibri" w:hAnsi="Calibri" w:cs="Calibri"/>
           <w:b w:val="0"/>
           <w:bCs w:val="0"/>
           <w:sz w:val="20"/>
@@ -4398,65 +4306,7 @@
       <w:pPr>
         <w:pStyle w:val="Heading1"/>
         <w:rPr>
-          <w:rFonts w:ascii="Century Gothic" w:hAnsi="Century Gothic"/>
-          <w:b w:val="0"/>
-          <w:bCs w:val="0"/>
-          <w:sz w:val="20"/>
-          <w:szCs w:val="20"/>
-        </w:rPr>
-      </w:pPr>
-      <w:proofErr w:type="gramStart"/>
-      <w:r>
-        <w:rPr>
-          <w:rFonts w:ascii="Century Gothic" w:hAnsi="Century Gothic"/>
-          <w:b w:val="0"/>
-          <w:bCs w:val="0"/>
-          <w:sz w:val="20"/>
-          <w:szCs w:val="20"/>
-        </w:rPr>
-        <w:t>Place :</w:t>
-      </w:r>
-      <w:proofErr w:type="gramEnd"/>
-      <w:r>
-        <w:rPr>
-          <w:rFonts w:ascii="Century Gothic" w:hAnsi="Century Gothic"/>
-          <w:b w:val="0"/>
-          <w:bCs w:val="0"/>
-          <w:sz w:val="20"/>
-          <w:szCs w:val="20"/>
-        </w:rPr>
-        <w:tab/>
-        <w:t xml:space="preserve">                                                                 Signature</w:t>
-      </w:r>
-    </w:p>
-    <w:p>
-      <w:pPr>
-        <w:pStyle w:val="Heading1"/>
-        <w:rPr>
-          <w:rFonts w:ascii="Century Gothic" w:hAnsi="Century Gothic"/>
-          <w:b w:val="0"/>
-          <w:bCs w:val="0"/>
-          <w:sz w:val="20"/>
-          <w:szCs w:val="20"/>
-        </w:rPr>
-      </w:pPr>
-      <w:r>
-        <w:rPr>
-          <w:rFonts w:ascii="Century Gothic" w:hAnsi="Century Gothic"/>
-          <w:b w:val="0"/>
-          <w:bCs w:val="0"/>
-          <w:sz w:val="20"/>
-          <w:szCs w:val="20"/>
-        </w:rPr>
-        <w:t xml:space="preserve">                                                                            </w:t>
-      </w:r>
-    </w:p>
-    <w:p>
-      <w:pPr>
-        <w:pStyle w:val="Heading1"/>
-        <w:ind w:left="0"/>
-        <w:rPr>
-          <w:rFonts w:ascii="Century Gothic" w:hAnsi="Century Gothic"/>
+          <w:rFonts w:ascii="Calibri" w:hAnsi="Calibri" w:cs="Calibri"/>
           <w:b w:val="0"/>
           <w:bCs w:val="0"/>
           <w:sz w:val="20"/>
@@ -4472,22 +4322,45 @@
           </w:cols>
         </w:sectPr>
       </w:pPr>
-      <w:r>
-        <w:rPr>
-          <w:rFonts w:ascii="Century Gothic" w:hAnsi="Century Gothic"/>
+      <w:proofErr w:type="gramStart"/>
+      <w:r>
+        <w:rPr>
+          <w:rFonts w:ascii="Calibri" w:hAnsi="Calibri" w:cs="Calibri"/>
           <w:b w:val="0"/>
           <w:bCs w:val="0"/>
           <w:sz w:val="20"/>
           <w:szCs w:val="20"/>
         </w:rPr>
-        <w:t xml:space="preserve">      </w:t>
+        <w:t>Place :</w:t>
+      </w:r>
+      <w:proofErr w:type="gramEnd"/>
+      <w:r>
+        <w:rPr>
+          <w:rFonts w:ascii="Calibri" w:hAnsi="Calibri" w:cs="Calibri"/>
+          <w:b w:val="0"/>
+          <w:bCs w:val="0"/>
+          <w:sz w:val="20"/>
+          <w:szCs w:val="20"/>
+        </w:rPr>
+        <w:tab/>
+        <w:t xml:space="preserve">                                                                 Signatur</w:t>
+      </w:r>
+      <w:r>
+        <w:rPr>
+          <w:rFonts w:ascii="Calibri" w:hAnsi="Calibri" w:cs="Calibri"/>
+          <w:b w:val="0"/>
+          <w:bCs w:val="0"/>
+          <w:sz w:val="20"/>
+          <w:szCs w:val="20"/>
+        </w:rPr>
+        <w:t>e</w:t>
       </w:r>
     </w:p>
     <w:p>
       <w:pPr>
         <w:pStyle w:val="BodyText"/>
         <w:rPr>
-          <w:rFonts w:ascii="Century Gothic" w:hAnsi="Century Gothic"/>
+          <w:rFonts w:ascii="Calibri" w:hAnsi="Calibri" w:cs="Calibri"/>
           <w:sz w:val="20"/>
           <w:szCs w:val="20"/>
         </w:rPr>

</xml_diff>